<commit_message>
Etapa 4 e Fase 0: regras da Guilda, modelo do save, documentação atualizada
- Etapa 4: regras puras com testes (taxa, XP, atributos, mochila, fim da partida)
  e o Balanceamento.md gerado pelo código, com testes de limite
- TASK-031: regras da Guilda (missões e contratos); RF52 no fim da partida
- TASK-020: habilidades, ativas e equipamento nos personagens; save conferido ao carregar
- TEST-003: valores negativos e limites dos contratos
- DOC-001: Requisitos, Casos de Uso, Histórias, diagrama da Partida e Conceito
  com a seção "Alterações do projeto"
- DOC-005: README do código; TASK-002: sobras do Vite apagadas
- PLANO.md com o plano até a entrega e protocolo de trabalho no CLAUDE.md

Co-Authored-By: Claude Opus 5.5 <noreply@anthropic.com>
</commit_message>
<xml_diff>
--- a/documentacao/ideias/01_Conceito_do_Jogo.docx
+++ b/documentacao/ideias/01_Conceito_do_Jogo.docx
@@ -382,6 +382,19 @@
           <w:szCs w:val="24"/>
         </w:rPr>
         <w:t xml:space="preserve">20. Glossário</w:t>
+      </w:r>
+    </w:p>
+    <w:p>
+      <w:pPr>
+        <w:spacing w:after="100"/>
+      </w:pPr>
+      <w:r>
+        <w:rPr>
+          <w:rFonts w:ascii="Calibri" w:cs="Calibri" w:eastAsia="Calibri" w:hAnsi="Calibri"/>
+          <w:sz w:val="24"/>
+          <w:szCs w:val="24"/>
+        </w:rPr>
+        <w:t xml:space="preserve">21. Alterações do projeto</w:t>
       </w:r>
     </w:p>
     <w:p>
@@ -12530,6 +12543,442 @@
         </w:tc>
       </w:tr>
     </w:tbl>
+    <w:p>
+      <w:r>
+        <w:br w:type="page"/>
+      </w:r>
+    </w:p>
+    <w:p>
+      <w:pPr>
+        <w:pStyle w:val="Heading1"/>
+        <w:spacing w:after="160" w:before="360"/>
+      </w:pPr>
+      <w:r>
+        <w:rPr>
+          <w:rFonts w:ascii="Calibri" w:cs="Calibri" w:eastAsia="Calibri" w:hAnsi="Calibri"/>
+        </w:rPr>
+        <w:t xml:space="preserve">21. Alterações do projeto</w:t>
+      </w:r>
+    </w:p>
+    <w:p>
+      <w:pPr>
+        <w:spacing w:after="120" w:line="300"/>
+      </w:pPr>
+      <w:r>
+        <w:rPr>
+          <w:rFonts w:ascii="Calibri" w:cs="Calibri" w:eastAsia="Calibri" w:hAnsi="Calibri"/>
+        </w:rPr>
+        <w:t xml:space="preserve">Esta seção registra o que mudou depois da versão final do conceito (02/10/2026), durante a programação do jogo. O texto das seções 1 a 20 foi mantido como estava. Quando algo desta seção for diferente do que está acima, vale esta seção. Os requisitos, os casos de uso, as histórias de usuário e o diagrama de atividades da partida já foram atualizados com estas mudanças.</w:t>
+      </w:r>
+    </w:p>
+    <w:p>
+      <w:pPr>
+        <w:pStyle w:val="Heading2"/>
+        <w:spacing w:after="120" w:before="240"/>
+      </w:pPr>
+      <w:r>
+        <w:rPr>
+          <w:rFonts w:ascii="Calibri" w:cs="Calibri" w:eastAsia="Calibri" w:hAnsi="Calibri"/>
+        </w:rPr>
+        <w:t xml:space="preserve">21.1 Telas e navegação</w:t>
+      </w:r>
+    </w:p>
+    <w:p>
+      <w:pPr>
+        <w:pStyle w:val="ListParagraph"/>
+        <w:numPr>
+          <w:ilvl w:val="0"/>
+          <w:numId w:val="3"/>
+        </w:numPr>
+        <w:spacing w:after="80" w:line="290"/>
+      </w:pPr>
+      <w:r>
+        <w:rPr>
+          <w:rFonts w:ascii="Calibri" w:cs="Calibri" w:eastAsia="Calibri" w:hAnsi="Calibri"/>
+          <w:b/>
+          <w:bCs/>
+        </w:rPr>
+        <w:t xml:space="preserve">Salão da Glória (§13): </w:t>
+      </w:r>
+      <w:r>
+        <w:rPr>
+          <w:rFonts w:ascii="Calibri" w:cs="Calibri" w:eastAsia="Calibri" w:hAnsi="Calibri"/>
+        </w:rPr>
+        <w:t xml:space="preserve">o botão de Ranking abre o Salão da Glória, que reúne o ranking, o histórico de partidas e as conquistas. As conquistas aparecem para quem já está jogando, convidado ou conta; o histórico continua só para quem tem conta.</w:t>
+      </w:r>
+    </w:p>
+    <w:p>
+      <w:pPr>
+        <w:pStyle w:val="ListParagraph"/>
+        <w:numPr>
+          <w:ilvl w:val="0"/>
+          <w:numId w:val="3"/>
+        </w:numPr>
+        <w:spacing w:after="80" w:line="290"/>
+      </w:pPr>
+      <w:r>
+        <w:rPr>
+          <w:rFonts w:ascii="Calibri" w:cs="Calibri" w:eastAsia="Calibri" w:hAnsi="Calibri"/>
+          <w:b/>
+          <w:bCs/>
+        </w:rPr>
+        <w:t xml:space="preserve">Minijogos (§3 e §14): </w:t>
+      </w:r>
+      <w:r>
+        <w:rPr>
+          <w:rFonts w:ascii="Calibri" w:cs="Calibri" w:eastAsia="Calibri" w:hAnsi="Calibri"/>
+        </w:rPr>
+        <w:t xml:space="preserve">Fazenda, Mina e Lago são acessados só pelo mapa, nunca pelo Reino. Ao sair do minijogo, o jogador volta ao mapa.</w:t>
+      </w:r>
+    </w:p>
+    <w:p>
+      <w:pPr>
+        <w:pStyle w:val="ListParagraph"/>
+        <w:numPr>
+          <w:ilvl w:val="0"/>
+          <w:numId w:val="3"/>
+        </w:numPr>
+        <w:spacing w:after="80" w:line="290"/>
+      </w:pPr>
+      <w:r>
+        <w:rPr>
+          <w:rFonts w:ascii="Calibri" w:cs="Calibri" w:eastAsia="Calibri" w:hAnsi="Calibri"/>
+          <w:b/>
+          <w:bCs/>
+        </w:rPr>
+        <w:t xml:space="preserve">Preparação (§3): </w:t>
+      </w:r>
+      <w:r>
+        <w:rPr>
+          <w:rFonts w:ascii="Calibri" w:cs="Calibri" w:eastAsia="Calibri" w:hAnsi="Calibri"/>
+        </w:rPr>
+        <w:t xml:space="preserve">além de "Voltar ao Reino", tem "Voltar ao Mapa", para trocar de bioma sem passar pelo Reino. Voltar não conta como partida.</w:t>
+      </w:r>
+    </w:p>
+    <w:p>
+      <w:pPr>
+        <w:pStyle w:val="ListParagraph"/>
+        <w:numPr>
+          <w:ilvl w:val="0"/>
+          <w:numId w:val="3"/>
+        </w:numPr>
+        <w:spacing w:after="80" w:line="290"/>
+      </w:pPr>
+      <w:r>
+        <w:rPr>
+          <w:rFonts w:ascii="Calibri" w:cs="Calibri" w:eastAsia="Calibri" w:hAnsi="Calibri"/>
+          <w:b/>
+          <w:bCs/>
+        </w:rPr>
+        <w:t xml:space="preserve">Sem atalho para sair da partida (§11.8): </w:t>
+      </w:r>
+      <w:r>
+        <w:rPr>
+          <w:rFonts w:ascii="Calibri" w:cs="Calibri" w:eastAsia="Calibri" w:hAnsi="Calibri"/>
+        </w:rPr>
+        <w:t xml:space="preserve">o "Voltar ao Reino" do menu de pausa começa o retorno normal de 15 segundos, como a tecla Q.</w:t>
+      </w:r>
+    </w:p>
+    <w:p>
+      <w:pPr>
+        <w:pStyle w:val="ListParagraph"/>
+        <w:numPr>
+          <w:ilvl w:val="0"/>
+          <w:numId w:val="3"/>
+        </w:numPr>
+        <w:spacing w:after="80" w:line="290"/>
+      </w:pPr>
+      <w:r>
+        <w:rPr>
+          <w:rFonts w:ascii="Calibri" w:cs="Calibri" w:eastAsia="Calibri" w:hAnsi="Calibri"/>
+          <w:b/>
+          <w:bCs/>
+        </w:rPr>
+        <w:t xml:space="preserve">Sair (§8 e §15): </w:t>
+      </w:r>
+      <w:r>
+        <w:rPr>
+          <w:rFonts w:ascii="Calibri" w:cs="Calibri" w:eastAsia="Calibri" w:hAnsi="Calibri"/>
+        </w:rPr>
+        <w:t xml:space="preserve">o convidado tem "Sair do jogo". Sair, do jogo ou da conta, recarrega a página e volta à Tela Inicial.</w:t>
+      </w:r>
+    </w:p>
+    <w:p>
+      <w:pPr>
+        <w:pStyle w:val="ListParagraph"/>
+        <w:numPr>
+          <w:ilvl w:val="0"/>
+          <w:numId w:val="3"/>
+        </w:numPr>
+        <w:spacing w:after="80" w:line="290"/>
+      </w:pPr>
+      <w:r>
+        <w:rPr>
+          <w:rFonts w:ascii="Calibri" w:cs="Calibri" w:eastAsia="Calibri" w:hAnsi="Calibri"/>
+          <w:b/>
+          <w:bCs/>
+        </w:rPr>
+        <w:t xml:space="preserve">Configurações (§15): </w:t>
+      </w:r>
+      <w:r>
+        <w:rPr>
+          <w:rFonts w:ascii="Calibri" w:cs="Calibri" w:eastAsia="Calibri" w:hAnsi="Calibri"/>
+        </w:rPr>
+        <w:t xml:space="preserve">"Música" (trilha) e "Som" (efeitos do jogo), cada um com liga/desliga, e o tema. Na partida, as Configurações ficam sem as opções de conta.</w:t>
+      </w:r>
+    </w:p>
+    <w:p>
+      <w:pPr>
+        <w:pStyle w:val="Heading2"/>
+        <w:spacing w:after="120" w:before="240"/>
+      </w:pPr>
+      <w:r>
+        <w:rPr>
+          <w:rFonts w:ascii="Calibri" w:cs="Calibri" w:eastAsia="Calibri" w:hAnsi="Calibri"/>
+        </w:rPr>
+        <w:t xml:space="preserve">21.2 Salvamento</w:t>
+      </w:r>
+    </w:p>
+    <w:p>
+      <w:pPr>
+        <w:pStyle w:val="ListParagraph"/>
+        <w:numPr>
+          <w:ilvl w:val="0"/>
+          <w:numId w:val="3"/>
+        </w:numPr>
+        <w:spacing w:after="80" w:line="290"/>
+      </w:pPr>
+      <w:r>
+        <w:rPr>
+          <w:rFonts w:ascii="Calibri" w:cs="Calibri" w:eastAsia="Calibri" w:hAnsi="Calibri"/>
+          <w:b/>
+          <w:bCs/>
+        </w:rPr>
+        <w:t xml:space="preserve">Quando salva (§9): </w:t>
+      </w:r>
+      <w:r>
+        <w:rPr>
+          <w:rFonts w:ascii="Calibri" w:cs="Calibri" w:eastAsia="Calibri" w:hAnsi="Calibri"/>
+        </w:rPr>
+        <w:t xml:space="preserve">além de a cada 3 minutos e em cada momento de salvamento, o jogo salva no navegador ao escolher a classe inicial e quando a aba é fechada ou escondida.</w:t>
+      </w:r>
+    </w:p>
+    <w:p>
+      <w:pPr>
+        <w:pStyle w:val="ListParagraph"/>
+        <w:numPr>
+          <w:ilvl w:val="0"/>
+          <w:numId w:val="3"/>
+        </w:numPr>
+        <w:spacing w:after="80" w:line="290"/>
+      </w:pPr>
+      <w:r>
+        <w:rPr>
+          <w:rFonts w:ascii="Calibri" w:cs="Calibri" w:eastAsia="Calibri" w:hAnsi="Calibri"/>
+          <w:b/>
+          <w:bCs/>
+        </w:rPr>
+        <w:t xml:space="preserve">Uma aba só (§8.1): </w:t>
+      </w:r>
+      <w:r>
+        <w:rPr>
+          <w:rFonts w:ascii="Calibri" w:cs="Calibri" w:eastAsia="Calibri" w:hAnsi="Calibri"/>
+        </w:rPr>
+        <w:t xml:space="preserve">a trava vale depois de entrar como convidado. A Tela Inicial e o Ranking podem ficar abertos em outra aba.</w:t>
+      </w:r>
+    </w:p>
+    <w:p>
+      <w:pPr>
+        <w:pStyle w:val="Heading2"/>
+        <w:spacing w:after="120" w:before="240"/>
+      </w:pPr>
+      <w:r>
+        <w:rPr>
+          <w:rFonts w:ascii="Calibri" w:cs="Calibri" w:eastAsia="Calibri" w:hAnsi="Calibri"/>
+        </w:rPr>
+        <w:t xml:space="preserve">21.3 Regras e números</w:t>
+      </w:r>
+    </w:p>
+    <w:p>
+      <w:pPr>
+        <w:pStyle w:val="ListParagraph"/>
+        <w:numPr>
+          <w:ilvl w:val="0"/>
+          <w:numId w:val="3"/>
+        </w:numPr>
+        <w:spacing w:after="80" w:line="290"/>
+      </w:pPr>
+      <w:r>
+        <w:rPr>
+          <w:rFonts w:ascii="Calibri" w:cs="Calibri" w:eastAsia="Calibri" w:hAnsi="Calibri"/>
+          <w:b/>
+          <w:bCs/>
+        </w:rPr>
+        <w:t xml:space="preserve">Arredondamento (§10.4 e §12): </w:t>
+      </w:r>
+      <w:r>
+        <w:rPr>
+          <w:rFonts w:ascii="Calibri" w:cs="Calibri" w:eastAsia="Calibri" w:hAnsi="Calibri"/>
+        </w:rPr>
+        <w:t xml:space="preserve">o ouro é sempre um número inteiro. A taxa em moedas, os +10% da Grande Vitória e a multa por abandonar uma missão são arredondados para baixo, a favor do jogador.</w:t>
+      </w:r>
+    </w:p>
+    <w:p>
+      <w:pPr>
+        <w:pStyle w:val="ListParagraph"/>
+        <w:numPr>
+          <w:ilvl w:val="0"/>
+          <w:numId w:val="3"/>
+        </w:numPr>
+        <w:spacing w:after="80" w:line="290"/>
+      </w:pPr>
+      <w:r>
+        <w:rPr>
+          <w:rFonts w:ascii="Calibri" w:cs="Calibri" w:eastAsia="Calibri" w:hAnsi="Calibri"/>
+          <w:b/>
+          <w:bCs/>
+        </w:rPr>
+        <w:t xml:space="preserve">Grande Vitória (§12.1): </w:t>
+      </w:r>
+      <w:r>
+        <w:rPr>
+          <w:rFonts w:ascii="Calibri" w:cs="Calibri" w:eastAsia="Calibri" w:hAnsi="Calibri"/>
+        </w:rPr>
+        <w:t xml:space="preserve">"pontuação base acima do mínimo" quer dizer maior que o mínimo; igual não basta.</w:t>
+      </w:r>
+    </w:p>
+    <w:p>
+      <w:pPr>
+        <w:pStyle w:val="ListParagraph"/>
+        <w:numPr>
+          <w:ilvl w:val="0"/>
+          <w:numId w:val="3"/>
+        </w:numPr>
+        <w:spacing w:after="80" w:line="290"/>
+      </w:pPr>
+      <w:r>
+        <w:rPr>
+          <w:rFonts w:ascii="Calibri" w:cs="Calibri" w:eastAsia="Calibri" w:hAnsi="Calibri"/>
+          <w:b/>
+          <w:bCs/>
+        </w:rPr>
+        <w:t xml:space="preserve">Divisão do XP (§6.1): </w:t>
+      </w:r>
+      <w:r>
+        <w:rPr>
+          <w:rFonts w:ascii="Calibri" w:cs="Calibri" w:eastAsia="Calibri" w:hAnsi="Calibri"/>
+        </w:rPr>
+        <w:t xml:space="preserve">quando a divisão não é exata, a sobra vai de 1 em 1, começando pelo Líder. Nenhum ponto de XP é perdido ou criado.</w:t>
+      </w:r>
+    </w:p>
+    <w:p>
+      <w:pPr>
+        <w:pStyle w:val="ListParagraph"/>
+        <w:numPr>
+          <w:ilvl w:val="0"/>
+          <w:numId w:val="3"/>
+        </w:numPr>
+        <w:spacing w:after="80" w:line="290"/>
+      </w:pPr>
+      <w:r>
+        <w:rPr>
+          <w:rFonts w:ascii="Calibri" w:cs="Calibri" w:eastAsia="Calibri" w:hAnsi="Calibri"/>
+          <w:b/>
+          <w:bCs/>
+        </w:rPr>
+        <w:t xml:space="preserve">XP guardado (§6): </w:t>
+      </w:r>
+      <w:r>
+        <w:rPr>
+          <w:rFonts w:ascii="Calibri" w:cs="Calibri" w:eastAsia="Calibri" w:hAnsi="Calibri"/>
+        </w:rPr>
+        <w:t xml:space="preserve">cada personagem guarda o XP que juntou dentro do nível atual. No nível 100, o XP a mais é descartado.</w:t>
+      </w:r>
+    </w:p>
+    <w:p>
+      <w:pPr>
+        <w:pStyle w:val="ListParagraph"/>
+        <w:numPr>
+          <w:ilvl w:val="0"/>
+          <w:numId w:val="3"/>
+        </w:numPr>
+        <w:spacing w:after="80" w:line="290"/>
+      </w:pPr>
+      <w:r>
+        <w:rPr>
+          <w:rFonts w:ascii="Calibri" w:cs="Calibri" w:eastAsia="Calibri" w:hAnsi="Calibri"/>
+          <w:b/>
+          <w:bCs/>
+        </w:rPr>
+        <w:t xml:space="preserve">Atributos (§6): </w:t>
+      </w:r>
+      <w:r>
+        <w:rPr>
+          <w:rFonts w:ascii="Calibri" w:cs="Calibri" w:eastAsia="Calibri" w:hAnsi="Calibri"/>
+        </w:rPr>
+        <w:t xml:space="preserve">cada atributo vai até 100, e um valor alto rende mais que em linha reta: o atributo 100 vale mais que o dobro do 50, sem exagero.</w:t>
+      </w:r>
+    </w:p>
+    <w:p>
+      <w:pPr>
+        <w:pStyle w:val="ListParagraph"/>
+        <w:numPr>
+          <w:ilvl w:val="0"/>
+          <w:numId w:val="3"/>
+        </w:numPr>
+        <w:spacing w:after="80" w:line="290"/>
+      </w:pPr>
+      <w:r>
+        <w:rPr>
+          <w:rFonts w:ascii="Calibri" w:cs="Calibri" w:eastAsia="Calibri" w:hAnsi="Calibri"/>
+          <w:b/>
+          <w:bCs/>
+        </w:rPr>
+        <w:t xml:space="preserve">Valores provisórios (§19): </w:t>
+      </w:r>
+      <w:r>
+        <w:rPr>
+          <w:rFonts w:ascii="Calibri" w:cs="Calibri" w:eastAsia="Calibri" w:hAnsi="Calibri"/>
+        </w:rPr>
+        <w:t xml:space="preserve">parte deles já tem um primeiro valor (curva de XP, pontos por nível, atributos iniciais, capacidade por ponto de Força, pesos da pontuação, mínimo da Grande Vitória, distância até a borda e contratos). Eles ficam no arquivo Balanceamento.md, na pasta da documentação, que é gerado pelo próprio código e tem testes que barram números absurdos. O resto entra conforme a programação avança, e os valores finais saem dos testes do beta.</w:t>
+      </w:r>
+    </w:p>
+    <w:p>
+      <w:pPr>
+        <w:pStyle w:val="Heading2"/>
+        <w:spacing w:after="120" w:before="240"/>
+      </w:pPr>
+      <w:r>
+        <w:rPr>
+          <w:rFonts w:ascii="Calibri" w:cs="Calibri" w:eastAsia="Calibri" w:hAnsi="Calibri"/>
+        </w:rPr>
+        <w:t xml:space="preserve">21.4 Tecnologia</w:t>
+      </w:r>
+    </w:p>
+    <w:p>
+      <w:pPr>
+        <w:pStyle w:val="ListParagraph"/>
+        <w:numPr>
+          <w:ilvl w:val="0"/>
+          <w:numId w:val="3"/>
+        </w:numPr>
+        <w:spacing w:after="80" w:line="290"/>
+      </w:pPr>
+      <w:r>
+        <w:rPr>
+          <w:rFonts w:ascii="Calibri" w:cs="Calibri" w:eastAsia="Calibri" w:hAnsi="Calibri"/>
+          <w:b/>
+          <w:bCs/>
+        </w:rPr>
+        <w:t xml:space="preserve">Camada de jogo (§2): </w:t>
+      </w:r>
+      <w:r>
+        <w:rPr>
+          <w:rFonts w:ascii="Calibri" w:cs="Calibri" w:eastAsia="Calibri" w:hAnsi="Calibri"/>
+        </w:rPr>
+        <w:t xml:space="preserve">a partida será desenhada em Canvas com Phaser. HUD, menus e janelas continuam em React.</w:t>
+      </w:r>
+    </w:p>
     <w:sectPr>
       <w:footerReference w:type="default" r:id="rId7"/>
       <w:pgSz w:w="11906" w:h="16838" w:orient="portrait"/>

</xml_diff>

<commit_message>
Fase 1, parte 5b.1: IA dos aliados em três níveis, sem tremor e com linha de tiro
- Níveis da IA pelo nível de cada personagem: básica (1-29), média (30-69) e avançada (70-100),
  com erros sorteados que diminuem com o nível; foco na avançada (regras/nivelDaIA.js)
- Avançada: formação de combate, Arqueiro no inimigo mais forte, recuo andando do golpe avisado
- Sem tremor: zona confortável em volta do Líder, folga, detector de tremor e passagem para o Líder
- Linha de tiro: Arqueiro e Mago não atiram na pedra (trocam de alvo ou se reposicionam)
- Aliados não esquivam: a esquiva é só do Líder
- Aperto: tirar de dentro das pedras e não empurrar ninguém para dentro delas
- Barra de teste com o seletor "IA:"; HUD mostra a IA de cada aliado e o foco
- Roteiro do navegador: tremor nos 3 níveis e linha de tiro (133 conferências)
- Documentação: RF36, RF42, UC31, HU31, Conceito 21.5, PLANO, CLAUDE, README e Balanceamento

Co-Authored-By: Claude Opus 5.5 <noreply@anthropic.com>
</commit_message>
<xml_diff>
--- a/documentacao/ideias/01_Conceito_do_Jogo.docx
+++ b/documentacao/ideias/01_Conceito_do_Jogo.docx
@@ -497,12 +497,6 @@
         <w:gridCol w:w="6826"/>
       </w:tblGrid>
       <w:tr>
-        <w:tblPrEx>
-          <w:tblCellMar>
-            <w:top w:w="0" w:type="dxa"/>
-            <w:bottom w:w="0" w:type="dxa"/>
-          </w:tblCellMar>
-        </w:tblPrEx>
         <w:trPr>
           <w:tblHeader/>
         </w:trPr>
@@ -568,12 +562,6 @@
         </w:tc>
       </w:tr>
       <w:tr>
-        <w:tblPrEx>
-          <w:tblCellMar>
-            <w:top w:w="0" w:type="dxa"/>
-            <w:bottom w:w="0" w:type="dxa"/>
-          </w:tblCellMar>
-        </w:tblPrEx>
         <w:tc>
           <w:tcPr>
             <w:tcW w:w="2200" w:type="dxa"/>
@@ -628,12 +616,6 @@
         </w:tc>
       </w:tr>
       <w:tr>
-        <w:tblPrEx>
-          <w:tblCellMar>
-            <w:top w:w="0" w:type="dxa"/>
-            <w:bottom w:w="0" w:type="dxa"/>
-          </w:tblCellMar>
-        </w:tblPrEx>
         <w:tc>
           <w:tcPr>
             <w:tcW w:w="2200" w:type="dxa"/>
@@ -688,12 +670,6 @@
         </w:tc>
       </w:tr>
       <w:tr>
-        <w:tblPrEx>
-          <w:tblCellMar>
-            <w:top w:w="0" w:type="dxa"/>
-            <w:bottom w:w="0" w:type="dxa"/>
-          </w:tblCellMar>
-        </w:tblPrEx>
         <w:tc>
           <w:tcPr>
             <w:tcW w:w="2200" w:type="dxa"/>
@@ -748,12 +724,6 @@
         </w:tc>
       </w:tr>
       <w:tr>
-        <w:tblPrEx>
-          <w:tblCellMar>
-            <w:top w:w="0" w:type="dxa"/>
-            <w:bottom w:w="0" w:type="dxa"/>
-          </w:tblCellMar>
-        </w:tblPrEx>
         <w:tc>
           <w:tcPr>
             <w:tcW w:w="2200" w:type="dxa"/>
@@ -808,12 +778,6 @@
         </w:tc>
       </w:tr>
       <w:tr>
-        <w:tblPrEx>
-          <w:tblCellMar>
-            <w:top w:w="0" w:type="dxa"/>
-            <w:bottom w:w="0" w:type="dxa"/>
-          </w:tblCellMar>
-        </w:tblPrEx>
         <w:tc>
           <w:tcPr>
             <w:tcW w:w="2200" w:type="dxa"/>
@@ -950,7 +914,6 @@
           <w:b/>
           <w:bCs/>
         </w:rPr>
-        <w:lastRenderedPageBreak/>
         <w:t>Reino:</w:t>
       </w:r>
       <w:r>
@@ -1291,7 +1254,6 @@
         <w:pStyle w:val="Ttulo1"/>
       </w:pPr>
       <w:r>
-        <w:lastRenderedPageBreak/>
         <w:t>5. Personagens e classes</w:t>
       </w:r>
     </w:p>
@@ -1318,12 +1280,6 @@
         <w:gridCol w:w="5726"/>
       </w:tblGrid>
       <w:tr>
-        <w:tblPrEx>
-          <w:tblCellMar>
-            <w:top w:w="0" w:type="dxa"/>
-            <w:bottom w:w="0" w:type="dxa"/>
-          </w:tblCellMar>
-        </w:tblPrEx>
         <w:trPr>
           <w:tblHeader/>
         </w:trPr>
@@ -1419,12 +1375,6 @@
         </w:tc>
       </w:tr>
       <w:tr>
-        <w:tblPrEx>
-          <w:tblCellMar>
-            <w:top w:w="0" w:type="dxa"/>
-            <w:bottom w:w="0" w:type="dxa"/>
-          </w:tblCellMar>
-        </w:tblPrEx>
         <w:tc>
           <w:tcPr>
             <w:tcW w:w="1500" w:type="dxa"/>
@@ -1505,12 +1455,6 @@
         </w:tc>
       </w:tr>
       <w:tr>
-        <w:tblPrEx>
-          <w:tblCellMar>
-            <w:top w:w="0" w:type="dxa"/>
-            <w:bottom w:w="0" w:type="dxa"/>
-          </w:tblCellMar>
-        </w:tblPrEx>
         <w:tc>
           <w:tcPr>
             <w:tcW w:w="1500" w:type="dxa"/>
@@ -1591,12 +1535,6 @@
         </w:tc>
       </w:tr>
       <w:tr>
-        <w:tblPrEx>
-          <w:tblCellMar>
-            <w:top w:w="0" w:type="dxa"/>
-            <w:bottom w:w="0" w:type="dxa"/>
-          </w:tblCellMar>
-        </w:tblPrEx>
         <w:tc>
           <w:tcPr>
             <w:tcW w:w="1500" w:type="dxa"/>
@@ -1677,12 +1615,6 @@
         </w:tc>
       </w:tr>
       <w:tr>
-        <w:tblPrEx>
-          <w:tblCellMar>
-            <w:top w:w="0" w:type="dxa"/>
-            <w:bottom w:w="0" w:type="dxa"/>
-          </w:tblCellMar>
-        </w:tblPrEx>
         <w:tc>
           <w:tcPr>
             <w:tcW w:w="1500" w:type="dxa"/>
@@ -1763,12 +1695,6 @@
         </w:tc>
       </w:tr>
       <w:tr>
-        <w:tblPrEx>
-          <w:tblCellMar>
-            <w:top w:w="0" w:type="dxa"/>
-            <w:bottom w:w="0" w:type="dxa"/>
-          </w:tblCellMar>
-        </w:tblPrEx>
         <w:tc>
           <w:tcPr>
             <w:tcW w:w="1500" w:type="dxa"/>
@@ -1975,12 +1901,6 @@
         <w:gridCol w:w="7026"/>
       </w:tblGrid>
       <w:tr>
-        <w:tblPrEx>
-          <w:tblCellMar>
-            <w:top w:w="0" w:type="dxa"/>
-            <w:bottom w:w="0" w:type="dxa"/>
-          </w:tblCellMar>
-        </w:tblPrEx>
         <w:trPr>
           <w:tblHeader/>
         </w:trPr>
@@ -2046,12 +1966,6 @@
         </w:tc>
       </w:tr>
       <w:tr>
-        <w:tblPrEx>
-          <w:tblCellMar>
-            <w:top w:w="0" w:type="dxa"/>
-            <w:bottom w:w="0" w:type="dxa"/>
-          </w:tblCellMar>
-        </w:tblPrEx>
         <w:tc>
           <w:tcPr>
             <w:tcW w:w="2000" w:type="dxa"/>
@@ -2106,12 +2020,6 @@
         </w:tc>
       </w:tr>
       <w:tr>
-        <w:tblPrEx>
-          <w:tblCellMar>
-            <w:top w:w="0" w:type="dxa"/>
-            <w:bottom w:w="0" w:type="dxa"/>
-          </w:tblCellMar>
-        </w:tblPrEx>
         <w:tc>
           <w:tcPr>
             <w:tcW w:w="2000" w:type="dxa"/>
@@ -2166,12 +2074,6 @@
         </w:tc>
       </w:tr>
       <w:tr>
-        <w:tblPrEx>
-          <w:tblCellMar>
-            <w:top w:w="0" w:type="dxa"/>
-            <w:bottom w:w="0" w:type="dxa"/>
-          </w:tblCellMar>
-        </w:tblPrEx>
         <w:tc>
           <w:tcPr>
             <w:tcW w:w="2000" w:type="dxa"/>
@@ -2226,12 +2128,6 @@
         </w:tc>
       </w:tr>
       <w:tr>
-        <w:tblPrEx>
-          <w:tblCellMar>
-            <w:top w:w="0" w:type="dxa"/>
-            <w:bottom w:w="0" w:type="dxa"/>
-          </w:tblCellMar>
-        </w:tblPrEx>
         <w:tc>
           <w:tcPr>
             <w:tcW w:w="2000" w:type="dxa"/>
@@ -2286,12 +2182,6 @@
         </w:tc>
       </w:tr>
       <w:tr>
-        <w:tblPrEx>
-          <w:tblCellMar>
-            <w:top w:w="0" w:type="dxa"/>
-            <w:bottom w:w="0" w:type="dxa"/>
-          </w:tblCellMar>
-        </w:tblPrEx>
         <w:tc>
           <w:tcPr>
             <w:tcW w:w="2000" w:type="dxa"/>
@@ -2376,12 +2266,6 @@
         <w:gridCol w:w="7026"/>
       </w:tblGrid>
       <w:tr>
-        <w:tblPrEx>
-          <w:tblCellMar>
-            <w:top w:w="0" w:type="dxa"/>
-            <w:bottom w:w="0" w:type="dxa"/>
-          </w:tblCellMar>
-        </w:tblPrEx>
         <w:trPr>
           <w:tblHeader/>
         </w:trPr>
@@ -2447,12 +2331,6 @@
         </w:tc>
       </w:tr>
       <w:tr>
-        <w:tblPrEx>
-          <w:tblCellMar>
-            <w:top w:w="0" w:type="dxa"/>
-            <w:bottom w:w="0" w:type="dxa"/>
-          </w:tblCellMar>
-        </w:tblPrEx>
         <w:tc>
           <w:tcPr>
             <w:tcW w:w="2000" w:type="dxa"/>
@@ -2507,12 +2385,6 @@
         </w:tc>
       </w:tr>
       <w:tr>
-        <w:tblPrEx>
-          <w:tblCellMar>
-            <w:top w:w="0" w:type="dxa"/>
-            <w:bottom w:w="0" w:type="dxa"/>
-          </w:tblCellMar>
-        </w:tblPrEx>
         <w:tc>
           <w:tcPr>
             <w:tcW w:w="2000" w:type="dxa"/>
@@ -2567,12 +2439,6 @@
         </w:tc>
       </w:tr>
       <w:tr>
-        <w:tblPrEx>
-          <w:tblCellMar>
-            <w:top w:w="0" w:type="dxa"/>
-            <w:bottom w:w="0" w:type="dxa"/>
-          </w:tblCellMar>
-        </w:tblPrEx>
         <w:tc>
           <w:tcPr>
             <w:tcW w:w="2000" w:type="dxa"/>
@@ -2627,12 +2493,6 @@
         </w:tc>
       </w:tr>
       <w:tr>
-        <w:tblPrEx>
-          <w:tblCellMar>
-            <w:top w:w="0" w:type="dxa"/>
-            <w:bottom w:w="0" w:type="dxa"/>
-          </w:tblCellMar>
-        </w:tblPrEx>
         <w:tc>
           <w:tcPr>
             <w:tcW w:w="2000" w:type="dxa"/>
@@ -2687,12 +2547,6 @@
         </w:tc>
       </w:tr>
       <w:tr>
-        <w:tblPrEx>
-          <w:tblCellMar>
-            <w:top w:w="0" w:type="dxa"/>
-            <w:bottom w:w="0" w:type="dxa"/>
-          </w:tblCellMar>
-        </w:tblPrEx>
         <w:tc>
           <w:tcPr>
             <w:tcW w:w="2000" w:type="dxa"/>
@@ -2802,7 +2656,6 @@
           <w:b/>
           <w:bCs/>
         </w:rPr>
-        <w:lastRenderedPageBreak/>
         <w:t>Mana:</w:t>
       </w:r>
       <w:r>
@@ -3151,7 +3004,6 @@
         <w:spacing w:after="120" w:line="300" w:lineRule="auto"/>
       </w:pPr>
       <w:r>
-        <w:lastRenderedPageBreak/>
         <w:t xml:space="preserve">O cadastro </w:t>
       </w:r>
       <w:r>
@@ -3505,12 +3357,6 @@
         <w:gridCol w:w="2000"/>
       </w:tblGrid>
       <w:tr>
-        <w:tblPrEx>
-          <w:tblCellMar>
-            <w:top w:w="0" w:type="dxa"/>
-            <w:bottom w:w="0" w:type="dxa"/>
-          </w:tblCellMar>
-        </w:tblPrEx>
         <w:trPr>
           <w:tblHeader/>
         </w:trPr>
@@ -3606,12 +3452,6 @@
         </w:tc>
       </w:tr>
       <w:tr>
-        <w:tblPrEx>
-          <w:tblCellMar>
-            <w:top w:w="0" w:type="dxa"/>
-            <w:bottom w:w="0" w:type="dxa"/>
-          </w:tblCellMar>
-        </w:tblPrEx>
         <w:tc>
           <w:tcPr>
             <w:tcW w:w="2600" w:type="dxa"/>
@@ -3692,12 +3532,6 @@
         </w:tc>
       </w:tr>
       <w:tr>
-        <w:tblPrEx>
-          <w:tblCellMar>
-            <w:top w:w="0" w:type="dxa"/>
-            <w:bottom w:w="0" w:type="dxa"/>
-          </w:tblCellMar>
-        </w:tblPrEx>
         <w:tc>
           <w:tcPr>
             <w:tcW w:w="2600" w:type="dxa"/>
@@ -3793,7 +3627,6 @@
         <w:spacing w:after="80" w:line="290" w:lineRule="auto"/>
       </w:pPr>
       <w:r>
-        <w:lastRenderedPageBreak/>
         <w:t>O banco só recebe dados nesses momentos, nunca a cada ação, para não ficar pesado.</w:t>
       </w:r>
     </w:p>
@@ -4135,7 +3968,6 @@
         <w:spacing w:after="80" w:line="290" w:lineRule="auto"/>
       </w:pPr>
       <w:r>
-        <w:lastRenderedPageBreak/>
         <w:t xml:space="preserve">O progresso só conta </w:t>
       </w:r>
       <w:r>
@@ -4289,12 +4121,6 @@
         <w:gridCol w:w="3213"/>
       </w:tblGrid>
       <w:tr>
-        <w:tblPrEx>
-          <w:tblCellMar>
-            <w:top w:w="0" w:type="dxa"/>
-            <w:bottom w:w="0" w:type="dxa"/>
-          </w:tblCellMar>
-        </w:tblPrEx>
         <w:trPr>
           <w:tblHeader/>
         </w:trPr>
@@ -4379,12 +4205,6 @@
         </w:tc>
       </w:tr>
       <w:tr>
-        <w:tblPrEx>
-          <w:tblCellMar>
-            <w:top w:w="0" w:type="dxa"/>
-            <w:bottom w:w="0" w:type="dxa"/>
-          </w:tblCellMar>
-        </w:tblPrEx>
         <w:tc>
           <w:tcPr>
             <w:tcW w:w="2600" w:type="dxa"/>
@@ -4465,12 +4285,6 @@
         </w:tc>
       </w:tr>
       <w:tr>
-        <w:tblPrEx>
-          <w:tblCellMar>
-            <w:top w:w="0" w:type="dxa"/>
-            <w:bottom w:w="0" w:type="dxa"/>
-          </w:tblCellMar>
-        </w:tblPrEx>
         <w:tc>
           <w:tcPr>
             <w:tcW w:w="2600" w:type="dxa"/>
@@ -4551,12 +4365,6 @@
         </w:tc>
       </w:tr>
       <w:tr>
-        <w:tblPrEx>
-          <w:tblCellMar>
-            <w:top w:w="0" w:type="dxa"/>
-            <w:bottom w:w="0" w:type="dxa"/>
-          </w:tblCellMar>
-        </w:tblPrEx>
         <w:tc>
           <w:tcPr>
             <w:tcW w:w="2600" w:type="dxa"/>
@@ -4637,12 +4445,6 @@
         </w:tc>
       </w:tr>
       <w:tr>
-        <w:tblPrEx>
-          <w:tblCellMar>
-            <w:top w:w="0" w:type="dxa"/>
-            <w:bottom w:w="0" w:type="dxa"/>
-          </w:tblCellMar>
-        </w:tblPrEx>
         <w:tc>
           <w:tcPr>
             <w:tcW w:w="2600" w:type="dxa"/>
@@ -4723,12 +4525,6 @@
         </w:tc>
       </w:tr>
       <w:tr>
-        <w:tblPrEx>
-          <w:tblCellMar>
-            <w:top w:w="0" w:type="dxa"/>
-            <w:bottom w:w="0" w:type="dxa"/>
-          </w:tblCellMar>
-        </w:tblPrEx>
         <w:tc>
           <w:tcPr>
             <w:tcW w:w="2600" w:type="dxa"/>
@@ -4809,12 +4605,6 @@
         </w:tc>
       </w:tr>
       <w:tr>
-        <w:tblPrEx>
-          <w:tblCellMar>
-            <w:top w:w="0" w:type="dxa"/>
-            <w:bottom w:w="0" w:type="dxa"/>
-          </w:tblCellMar>
-        </w:tblPrEx>
         <w:tc>
           <w:tcPr>
             <w:tcW w:w="2600" w:type="dxa"/>
@@ -5009,12 +4799,6 @@
         <w:gridCol w:w="7226"/>
       </w:tblGrid>
       <w:tr>
-        <w:tblPrEx>
-          <w:tblCellMar>
-            <w:top w:w="0" w:type="dxa"/>
-            <w:bottom w:w="0" w:type="dxa"/>
-          </w:tblCellMar>
-        </w:tblPrEx>
         <w:trPr>
           <w:tblHeader/>
         </w:trPr>
@@ -5080,12 +4864,6 @@
         </w:tc>
       </w:tr>
       <w:tr>
-        <w:tblPrEx>
-          <w:tblCellMar>
-            <w:top w:w="0" w:type="dxa"/>
-            <w:bottom w:w="0" w:type="dxa"/>
-          </w:tblCellMar>
-        </w:tblPrEx>
         <w:tc>
           <w:tcPr>
             <w:tcW w:w="1800" w:type="dxa"/>
@@ -5140,12 +4918,6 @@
         </w:tc>
       </w:tr>
       <w:tr>
-        <w:tblPrEx>
-          <w:tblCellMar>
-            <w:top w:w="0" w:type="dxa"/>
-            <w:bottom w:w="0" w:type="dxa"/>
-          </w:tblCellMar>
-        </w:tblPrEx>
         <w:tc>
           <w:tcPr>
             <w:tcW w:w="1800" w:type="dxa"/>
@@ -5200,12 +4972,6 @@
         </w:tc>
       </w:tr>
       <w:tr>
-        <w:tblPrEx>
-          <w:tblCellMar>
-            <w:top w:w="0" w:type="dxa"/>
-            <w:bottom w:w="0" w:type="dxa"/>
-          </w:tblCellMar>
-        </w:tblPrEx>
         <w:tc>
           <w:tcPr>
             <w:tcW w:w="1800" w:type="dxa"/>
@@ -5260,12 +5026,6 @@
         </w:tc>
       </w:tr>
       <w:tr>
-        <w:tblPrEx>
-          <w:tblCellMar>
-            <w:top w:w="0" w:type="dxa"/>
-            <w:bottom w:w="0" w:type="dxa"/>
-          </w:tblCellMar>
-        </w:tblPrEx>
         <w:tc>
           <w:tcPr>
             <w:tcW w:w="1800" w:type="dxa"/>
@@ -5320,12 +5080,6 @@
         </w:tc>
       </w:tr>
       <w:tr>
-        <w:tblPrEx>
-          <w:tblCellMar>
-            <w:top w:w="0" w:type="dxa"/>
-            <w:bottom w:w="0" w:type="dxa"/>
-          </w:tblCellMar>
-        </w:tblPrEx>
         <w:tc>
           <w:tcPr>
             <w:tcW w:w="1800" w:type="dxa"/>
@@ -5380,12 +5134,6 @@
         </w:tc>
       </w:tr>
       <w:tr>
-        <w:tblPrEx>
-          <w:tblCellMar>
-            <w:top w:w="0" w:type="dxa"/>
-            <w:bottom w:w="0" w:type="dxa"/>
-          </w:tblCellMar>
-        </w:tblPrEx>
         <w:tc>
           <w:tcPr>
             <w:tcW w:w="1800" w:type="dxa"/>
@@ -5440,12 +5188,6 @@
         </w:tc>
       </w:tr>
       <w:tr>
-        <w:tblPrEx>
-          <w:tblCellMar>
-            <w:top w:w="0" w:type="dxa"/>
-            <w:bottom w:w="0" w:type="dxa"/>
-          </w:tblCellMar>
-        </w:tblPrEx>
         <w:tc>
           <w:tcPr>
             <w:tcW w:w="1800" w:type="dxa"/>
@@ -5500,12 +5242,6 @@
         </w:tc>
       </w:tr>
       <w:tr>
-        <w:tblPrEx>
-          <w:tblCellMar>
-            <w:top w:w="0" w:type="dxa"/>
-            <w:bottom w:w="0" w:type="dxa"/>
-          </w:tblCellMar>
-        </w:tblPrEx>
         <w:tc>
           <w:tcPr>
             <w:tcW w:w="1800" w:type="dxa"/>
@@ -5560,12 +5296,6 @@
         </w:tc>
       </w:tr>
       <w:tr>
-        <w:tblPrEx>
-          <w:tblCellMar>
-            <w:top w:w="0" w:type="dxa"/>
-            <w:bottom w:w="0" w:type="dxa"/>
-          </w:tblCellMar>
-        </w:tblPrEx>
         <w:tc>
           <w:tcPr>
             <w:tcW w:w="1800" w:type="dxa"/>
@@ -5620,12 +5350,6 @@
         </w:tc>
       </w:tr>
       <w:tr>
-        <w:tblPrEx>
-          <w:tblCellMar>
-            <w:top w:w="0" w:type="dxa"/>
-            <w:bottom w:w="0" w:type="dxa"/>
-          </w:tblCellMar>
-        </w:tblPrEx>
         <w:tc>
           <w:tcPr>
             <w:tcW w:w="1800" w:type="dxa"/>
@@ -5680,12 +5404,6 @@
         </w:tc>
       </w:tr>
       <w:tr>
-        <w:tblPrEx>
-          <w:tblCellMar>
-            <w:top w:w="0" w:type="dxa"/>
-            <w:bottom w:w="0" w:type="dxa"/>
-          </w:tblCellMar>
-        </w:tblPrEx>
         <w:tc>
           <w:tcPr>
             <w:tcW w:w="1800" w:type="dxa"/>
@@ -6383,12 +6101,6 @@
         <w:gridCol w:w="2800"/>
       </w:tblGrid>
       <w:tr>
-        <w:tblPrEx>
-          <w:tblCellMar>
-            <w:top w:w="0" w:type="dxa"/>
-            <w:bottom w:w="0" w:type="dxa"/>
-          </w:tblCellMar>
-        </w:tblPrEx>
         <w:trPr>
           <w:tblHeader/>
         </w:trPr>
@@ -6484,12 +6196,6 @@
         </w:tc>
       </w:tr>
       <w:tr>
-        <w:tblPrEx>
-          <w:tblCellMar>
-            <w:top w:w="0" w:type="dxa"/>
-            <w:bottom w:w="0" w:type="dxa"/>
-          </w:tblCellMar>
-        </w:tblPrEx>
         <w:tc>
           <w:tcPr>
             <w:tcW w:w="2000" w:type="dxa"/>
@@ -6570,12 +6276,6 @@
         </w:tc>
       </w:tr>
       <w:tr>
-        <w:tblPrEx>
-          <w:tblCellMar>
-            <w:top w:w="0" w:type="dxa"/>
-            <w:bottom w:w="0" w:type="dxa"/>
-          </w:tblCellMar>
-        </w:tblPrEx>
         <w:tc>
           <w:tcPr>
             <w:tcW w:w="2000" w:type="dxa"/>
@@ -6656,12 +6356,6 @@
         </w:tc>
       </w:tr>
       <w:tr>
-        <w:tblPrEx>
-          <w:tblCellMar>
-            <w:top w:w="0" w:type="dxa"/>
-            <w:bottom w:w="0" w:type="dxa"/>
-          </w:tblCellMar>
-        </w:tblPrEx>
         <w:tc>
           <w:tcPr>
             <w:tcW w:w="2000" w:type="dxa"/>
@@ -6742,12 +6436,6 @@
         </w:tc>
       </w:tr>
       <w:tr>
-        <w:tblPrEx>
-          <w:tblCellMar>
-            <w:top w:w="0" w:type="dxa"/>
-            <w:bottom w:w="0" w:type="dxa"/>
-          </w:tblCellMar>
-        </w:tblPrEx>
         <w:tc>
           <w:tcPr>
             <w:tcW w:w="2000" w:type="dxa"/>
@@ -7044,12 +6732,6 @@
         <w:gridCol w:w="1734"/>
       </w:tblGrid>
       <w:tr>
-        <w:tblPrEx>
-          <w:tblCellMar>
-            <w:top w:w="0" w:type="dxa"/>
-            <w:bottom w:w="0" w:type="dxa"/>
-          </w:tblCellMar>
-        </w:tblPrEx>
         <w:trPr>
           <w:tblHeader/>
         </w:trPr>
@@ -7175,12 +6857,6 @@
         </w:tc>
       </w:tr>
       <w:tr>
-        <w:tblPrEx>
-          <w:tblCellMar>
-            <w:top w:w="0" w:type="dxa"/>
-            <w:bottom w:w="0" w:type="dxa"/>
-          </w:tblCellMar>
-        </w:tblPrEx>
         <w:tc>
           <w:tcPr>
             <w:tcW w:w="3826" w:type="dxa"/>
@@ -7287,12 +6963,6 @@
         </w:tc>
       </w:tr>
       <w:tr>
-        <w:tblPrEx>
-          <w:tblCellMar>
-            <w:top w:w="0" w:type="dxa"/>
-            <w:bottom w:w="0" w:type="dxa"/>
-          </w:tblCellMar>
-        </w:tblPrEx>
         <w:tc>
           <w:tcPr>
             <w:tcW w:w="3826" w:type="dxa"/>
@@ -7399,12 +7069,6 @@
         </w:tc>
       </w:tr>
       <w:tr>
-        <w:tblPrEx>
-          <w:tblCellMar>
-            <w:top w:w="0" w:type="dxa"/>
-            <w:bottom w:w="0" w:type="dxa"/>
-          </w:tblCellMar>
-        </w:tblPrEx>
         <w:tc>
           <w:tcPr>
             <w:tcW w:w="3826" w:type="dxa"/>
@@ -7511,12 +7175,6 @@
         </w:tc>
       </w:tr>
       <w:tr>
-        <w:tblPrEx>
-          <w:tblCellMar>
-            <w:top w:w="0" w:type="dxa"/>
-            <w:bottom w:w="0" w:type="dxa"/>
-          </w:tblCellMar>
-        </w:tblPrEx>
         <w:tc>
           <w:tcPr>
             <w:tcW w:w="3826" w:type="dxa"/>
@@ -7623,12 +7281,6 @@
         </w:tc>
       </w:tr>
       <w:tr>
-        <w:tblPrEx>
-          <w:tblCellMar>
-            <w:top w:w="0" w:type="dxa"/>
-            <w:bottom w:w="0" w:type="dxa"/>
-          </w:tblCellMar>
-        </w:tblPrEx>
         <w:tc>
           <w:tcPr>
             <w:tcW w:w="3826" w:type="dxa"/>
@@ -7735,12 +7387,6 @@
         </w:tc>
       </w:tr>
       <w:tr>
-        <w:tblPrEx>
-          <w:tblCellMar>
-            <w:top w:w="0" w:type="dxa"/>
-            <w:bottom w:w="0" w:type="dxa"/>
-          </w:tblCellMar>
-        </w:tblPrEx>
         <w:tc>
           <w:tcPr>
             <w:tcW w:w="3826" w:type="dxa"/>
@@ -7877,12 +7523,6 @@
         <w:gridCol w:w="1734"/>
       </w:tblGrid>
       <w:tr>
-        <w:tblPrEx>
-          <w:tblCellMar>
-            <w:top w:w="0" w:type="dxa"/>
-            <w:bottom w:w="0" w:type="dxa"/>
-          </w:tblCellMar>
-        </w:tblPrEx>
         <w:trPr>
           <w:tblHeader/>
         </w:trPr>
@@ -8008,12 +7648,6 @@
         </w:tc>
       </w:tr>
       <w:tr>
-        <w:tblPrEx>
-          <w:tblCellMar>
-            <w:top w:w="0" w:type="dxa"/>
-            <w:bottom w:w="0" w:type="dxa"/>
-          </w:tblCellMar>
-        </w:tblPrEx>
         <w:tc>
           <w:tcPr>
             <w:tcW w:w="3826" w:type="dxa"/>
@@ -8120,12 +7754,6 @@
         </w:tc>
       </w:tr>
       <w:tr>
-        <w:tblPrEx>
-          <w:tblCellMar>
-            <w:top w:w="0" w:type="dxa"/>
-            <w:bottom w:w="0" w:type="dxa"/>
-          </w:tblCellMar>
-        </w:tblPrEx>
         <w:tc>
           <w:tcPr>
             <w:tcW w:w="3826" w:type="dxa"/>
@@ -8232,12 +7860,6 @@
         </w:tc>
       </w:tr>
       <w:tr>
-        <w:tblPrEx>
-          <w:tblCellMar>
-            <w:top w:w="0" w:type="dxa"/>
-            <w:bottom w:w="0" w:type="dxa"/>
-          </w:tblCellMar>
-        </w:tblPrEx>
         <w:tc>
           <w:tcPr>
             <w:tcW w:w="3826" w:type="dxa"/>
@@ -8344,12 +7966,6 @@
         </w:tc>
       </w:tr>
       <w:tr>
-        <w:tblPrEx>
-          <w:tblCellMar>
-            <w:top w:w="0" w:type="dxa"/>
-            <w:bottom w:w="0" w:type="dxa"/>
-          </w:tblCellMar>
-        </w:tblPrEx>
         <w:tc>
           <w:tcPr>
             <w:tcW w:w="3826" w:type="dxa"/>
@@ -8736,12 +8352,6 @@
         <w:gridCol w:w="6426"/>
       </w:tblGrid>
       <w:tr>
-        <w:tblPrEx>
-          <w:tblCellMar>
-            <w:top w:w="0" w:type="dxa"/>
-            <w:bottom w:w="0" w:type="dxa"/>
-          </w:tblCellMar>
-        </w:tblPrEx>
         <w:trPr>
           <w:tblHeader/>
         </w:trPr>
@@ -8807,12 +8417,6 @@
         </w:tc>
       </w:tr>
       <w:tr>
-        <w:tblPrEx>
-          <w:tblCellMar>
-            <w:top w:w="0" w:type="dxa"/>
-            <w:bottom w:w="0" w:type="dxa"/>
-          </w:tblCellMar>
-        </w:tblPrEx>
         <w:tc>
           <w:tcPr>
             <w:tcW w:w="2600" w:type="dxa"/>
@@ -8867,12 +8471,6 @@
         </w:tc>
       </w:tr>
       <w:tr>
-        <w:tblPrEx>
-          <w:tblCellMar>
-            <w:top w:w="0" w:type="dxa"/>
-            <w:bottom w:w="0" w:type="dxa"/>
-          </w:tblCellMar>
-        </w:tblPrEx>
         <w:tc>
           <w:tcPr>
             <w:tcW w:w="2600" w:type="dxa"/>
@@ -8927,12 +8525,6 @@
         </w:tc>
       </w:tr>
       <w:tr>
-        <w:tblPrEx>
-          <w:tblCellMar>
-            <w:top w:w="0" w:type="dxa"/>
-            <w:bottom w:w="0" w:type="dxa"/>
-          </w:tblCellMar>
-        </w:tblPrEx>
         <w:tc>
           <w:tcPr>
             <w:tcW w:w="2600" w:type="dxa"/>
@@ -8987,12 +8579,6 @@
         </w:tc>
       </w:tr>
       <w:tr>
-        <w:tblPrEx>
-          <w:tblCellMar>
-            <w:top w:w="0" w:type="dxa"/>
-            <w:bottom w:w="0" w:type="dxa"/>
-          </w:tblCellMar>
-        </w:tblPrEx>
         <w:tc>
           <w:tcPr>
             <w:tcW w:w="2600" w:type="dxa"/>
@@ -9047,12 +8633,6 @@
         </w:tc>
       </w:tr>
       <w:tr>
-        <w:tblPrEx>
-          <w:tblCellMar>
-            <w:top w:w="0" w:type="dxa"/>
-            <w:bottom w:w="0" w:type="dxa"/>
-          </w:tblCellMar>
-        </w:tblPrEx>
         <w:tc>
           <w:tcPr>
             <w:tcW w:w="2600" w:type="dxa"/>
@@ -9107,12 +8687,6 @@
         </w:tc>
       </w:tr>
       <w:tr>
-        <w:tblPrEx>
-          <w:tblCellMar>
-            <w:top w:w="0" w:type="dxa"/>
-            <w:bottom w:w="0" w:type="dxa"/>
-          </w:tblCellMar>
-        </w:tblPrEx>
         <w:tc>
           <w:tcPr>
             <w:tcW w:w="2600" w:type="dxa"/>
@@ -9354,12 +8928,6 @@
         <w:gridCol w:w="5426"/>
       </w:tblGrid>
       <w:tr>
-        <w:tblPrEx>
-          <w:tblCellMar>
-            <w:top w:w="0" w:type="dxa"/>
-            <w:bottom w:w="0" w:type="dxa"/>
-          </w:tblCellMar>
-        </w:tblPrEx>
         <w:trPr>
           <w:tblHeader/>
         </w:trPr>
@@ -9425,12 +8993,6 @@
         </w:tc>
       </w:tr>
       <w:tr>
-        <w:tblPrEx>
-          <w:tblCellMar>
-            <w:top w:w="0" w:type="dxa"/>
-            <w:bottom w:w="0" w:type="dxa"/>
-          </w:tblCellMar>
-        </w:tblPrEx>
         <w:tc>
           <w:tcPr>
             <w:tcW w:w="3600" w:type="dxa"/>
@@ -9485,12 +9047,6 @@
         </w:tc>
       </w:tr>
       <w:tr>
-        <w:tblPrEx>
-          <w:tblCellMar>
-            <w:top w:w="0" w:type="dxa"/>
-            <w:bottom w:w="0" w:type="dxa"/>
-          </w:tblCellMar>
-        </w:tblPrEx>
         <w:tc>
           <w:tcPr>
             <w:tcW w:w="3600" w:type="dxa"/>
@@ -9545,12 +9101,6 @@
         </w:tc>
       </w:tr>
       <w:tr>
-        <w:tblPrEx>
-          <w:tblCellMar>
-            <w:top w:w="0" w:type="dxa"/>
-            <w:bottom w:w="0" w:type="dxa"/>
-          </w:tblCellMar>
-        </w:tblPrEx>
         <w:tc>
           <w:tcPr>
             <w:tcW w:w="3600" w:type="dxa"/>
@@ -9605,12 +9155,6 @@
         </w:tc>
       </w:tr>
       <w:tr>
-        <w:tblPrEx>
-          <w:tblCellMar>
-            <w:top w:w="0" w:type="dxa"/>
-            <w:bottom w:w="0" w:type="dxa"/>
-          </w:tblCellMar>
-        </w:tblPrEx>
         <w:tc>
           <w:tcPr>
             <w:tcW w:w="3600" w:type="dxa"/>
@@ -9665,12 +9209,6 @@
         </w:tc>
       </w:tr>
       <w:tr>
-        <w:tblPrEx>
-          <w:tblCellMar>
-            <w:top w:w="0" w:type="dxa"/>
-            <w:bottom w:w="0" w:type="dxa"/>
-          </w:tblCellMar>
-        </w:tblPrEx>
         <w:tc>
           <w:tcPr>
             <w:tcW w:w="3600" w:type="dxa"/>
@@ -9725,12 +9263,6 @@
         </w:tc>
       </w:tr>
       <w:tr>
-        <w:tblPrEx>
-          <w:tblCellMar>
-            <w:top w:w="0" w:type="dxa"/>
-            <w:bottom w:w="0" w:type="dxa"/>
-          </w:tblCellMar>
-        </w:tblPrEx>
         <w:tc>
           <w:tcPr>
             <w:tcW w:w="3600" w:type="dxa"/>
@@ -9785,12 +9317,6 @@
         </w:tc>
       </w:tr>
       <w:tr>
-        <w:tblPrEx>
-          <w:tblCellMar>
-            <w:top w:w="0" w:type="dxa"/>
-            <w:bottom w:w="0" w:type="dxa"/>
-          </w:tblCellMar>
-        </w:tblPrEx>
         <w:tc>
           <w:tcPr>
             <w:tcW w:w="3600" w:type="dxa"/>
@@ -9845,12 +9371,6 @@
         </w:tc>
       </w:tr>
       <w:tr>
-        <w:tblPrEx>
-          <w:tblCellMar>
-            <w:top w:w="0" w:type="dxa"/>
-            <w:bottom w:w="0" w:type="dxa"/>
-          </w:tblCellMar>
-        </w:tblPrEx>
         <w:tc>
           <w:tcPr>
             <w:tcW w:w="3600" w:type="dxa"/>
@@ -9905,12 +9425,6 @@
         </w:tc>
       </w:tr>
       <w:tr>
-        <w:tblPrEx>
-          <w:tblCellMar>
-            <w:top w:w="0" w:type="dxa"/>
-            <w:bottom w:w="0" w:type="dxa"/>
-          </w:tblCellMar>
-        </w:tblPrEx>
         <w:tc>
           <w:tcPr>
             <w:tcW w:w="3600" w:type="dxa"/>
@@ -9965,12 +9479,6 @@
         </w:tc>
       </w:tr>
       <w:tr>
-        <w:tblPrEx>
-          <w:tblCellMar>
-            <w:top w:w="0" w:type="dxa"/>
-            <w:bottom w:w="0" w:type="dxa"/>
-          </w:tblCellMar>
-        </w:tblPrEx>
         <w:tc>
           <w:tcPr>
             <w:tcW w:w="3600" w:type="dxa"/>
@@ -10025,12 +9533,6 @@
         </w:tc>
       </w:tr>
       <w:tr>
-        <w:tblPrEx>
-          <w:tblCellMar>
-            <w:top w:w="0" w:type="dxa"/>
-            <w:bottom w:w="0" w:type="dxa"/>
-          </w:tblCellMar>
-        </w:tblPrEx>
         <w:tc>
           <w:tcPr>
             <w:tcW w:w="3600" w:type="dxa"/>
@@ -10085,12 +9587,6 @@
         </w:tc>
       </w:tr>
       <w:tr>
-        <w:tblPrEx>
-          <w:tblCellMar>
-            <w:top w:w="0" w:type="dxa"/>
-            <w:bottom w:w="0" w:type="dxa"/>
-          </w:tblCellMar>
-        </w:tblPrEx>
         <w:tc>
           <w:tcPr>
             <w:tcW w:w="3600" w:type="dxa"/>
@@ -10145,12 +9641,6 @@
         </w:tc>
       </w:tr>
       <w:tr>
-        <w:tblPrEx>
-          <w:tblCellMar>
-            <w:top w:w="0" w:type="dxa"/>
-            <w:bottom w:w="0" w:type="dxa"/>
-          </w:tblCellMar>
-        </w:tblPrEx>
         <w:tc>
           <w:tcPr>
             <w:tcW w:w="3600" w:type="dxa"/>
@@ -10205,12 +9695,6 @@
         </w:tc>
       </w:tr>
       <w:tr>
-        <w:tblPrEx>
-          <w:tblCellMar>
-            <w:top w:w="0" w:type="dxa"/>
-            <w:bottom w:w="0" w:type="dxa"/>
-          </w:tblCellMar>
-        </w:tblPrEx>
         <w:tc>
           <w:tcPr>
             <w:tcW w:w="3600" w:type="dxa"/>
@@ -10807,12 +10291,6 @@
         <w:gridCol w:w="6826"/>
       </w:tblGrid>
       <w:tr>
-        <w:tblPrEx>
-          <w:tblCellMar>
-            <w:top w:w="0" w:type="dxa"/>
-            <w:bottom w:w="0" w:type="dxa"/>
-          </w:tblCellMar>
-        </w:tblPrEx>
         <w:trPr>
           <w:tblHeader/>
         </w:trPr>
@@ -10878,12 +10356,6 @@
         </w:tc>
       </w:tr>
       <w:tr>
-        <w:tblPrEx>
-          <w:tblCellMar>
-            <w:top w:w="0" w:type="dxa"/>
-            <w:bottom w:w="0" w:type="dxa"/>
-          </w:tblCellMar>
-        </w:tblPrEx>
         <w:tc>
           <w:tcPr>
             <w:tcW w:w="2200" w:type="dxa"/>
@@ -10938,12 +10410,6 @@
         </w:tc>
       </w:tr>
       <w:tr>
-        <w:tblPrEx>
-          <w:tblCellMar>
-            <w:top w:w="0" w:type="dxa"/>
-            <w:bottom w:w="0" w:type="dxa"/>
-          </w:tblCellMar>
-        </w:tblPrEx>
         <w:tc>
           <w:tcPr>
             <w:tcW w:w="2200" w:type="dxa"/>
@@ -10998,12 +10464,6 @@
         </w:tc>
       </w:tr>
       <w:tr>
-        <w:tblPrEx>
-          <w:tblCellMar>
-            <w:top w:w="0" w:type="dxa"/>
-            <w:bottom w:w="0" w:type="dxa"/>
-          </w:tblCellMar>
-        </w:tblPrEx>
         <w:tc>
           <w:tcPr>
             <w:tcW w:w="2200" w:type="dxa"/>
@@ -11058,12 +10518,6 @@
         </w:tc>
       </w:tr>
       <w:tr>
-        <w:tblPrEx>
-          <w:tblCellMar>
-            <w:top w:w="0" w:type="dxa"/>
-            <w:bottom w:w="0" w:type="dxa"/>
-          </w:tblCellMar>
-        </w:tblPrEx>
         <w:tc>
           <w:tcPr>
             <w:tcW w:w="2200" w:type="dxa"/>
@@ -11118,12 +10572,6 @@
         </w:tc>
       </w:tr>
       <w:tr>
-        <w:tblPrEx>
-          <w:tblCellMar>
-            <w:top w:w="0" w:type="dxa"/>
-            <w:bottom w:w="0" w:type="dxa"/>
-          </w:tblCellMar>
-        </w:tblPrEx>
         <w:tc>
           <w:tcPr>
             <w:tcW w:w="2200" w:type="dxa"/>
@@ -11178,12 +10626,6 @@
         </w:tc>
       </w:tr>
       <w:tr>
-        <w:tblPrEx>
-          <w:tblCellMar>
-            <w:top w:w="0" w:type="dxa"/>
-            <w:bottom w:w="0" w:type="dxa"/>
-          </w:tblCellMar>
-        </w:tblPrEx>
         <w:tc>
           <w:tcPr>
             <w:tcW w:w="2200" w:type="dxa"/>
@@ -11238,12 +10680,6 @@
         </w:tc>
       </w:tr>
       <w:tr>
-        <w:tblPrEx>
-          <w:tblCellMar>
-            <w:top w:w="0" w:type="dxa"/>
-            <w:bottom w:w="0" w:type="dxa"/>
-          </w:tblCellMar>
-        </w:tblPrEx>
         <w:tc>
           <w:tcPr>
             <w:tcW w:w="2200" w:type="dxa"/>
@@ -11298,12 +10734,6 @@
         </w:tc>
       </w:tr>
       <w:tr>
-        <w:tblPrEx>
-          <w:tblCellMar>
-            <w:top w:w="0" w:type="dxa"/>
-            <w:bottom w:w="0" w:type="dxa"/>
-          </w:tblCellMar>
-        </w:tblPrEx>
         <w:tc>
           <w:tcPr>
             <w:tcW w:w="2200" w:type="dxa"/>
@@ -11358,12 +10788,6 @@
         </w:tc>
       </w:tr>
       <w:tr>
-        <w:tblPrEx>
-          <w:tblCellMar>
-            <w:top w:w="0" w:type="dxa"/>
-            <w:bottom w:w="0" w:type="dxa"/>
-          </w:tblCellMar>
-        </w:tblPrEx>
         <w:tc>
           <w:tcPr>
             <w:tcW w:w="2200" w:type="dxa"/>
@@ -11418,12 +10842,6 @@
         </w:tc>
       </w:tr>
       <w:tr>
-        <w:tblPrEx>
-          <w:tblCellMar>
-            <w:top w:w="0" w:type="dxa"/>
-            <w:bottom w:w="0" w:type="dxa"/>
-          </w:tblCellMar>
-        </w:tblPrEx>
         <w:tc>
           <w:tcPr>
             <w:tcW w:w="2200" w:type="dxa"/>
@@ -11856,6 +11274,25 @@
       </w:r>
       <w:r>
         <w:t xml:space="preserve"> nenhum inimigo vivo perto de quem caiu; o raio é um valor de balanceamento (provisório: 250 px na arena de teste). A ajuda de 5 segundos começa sozinha quando um aliado ou o Líder fica parado perto do caído, sem tecla, e volta a zero se a área sujar ou o ajudante sair. A Ressurreição não precisa de área limpa.</w:t>
+      </w:r>
+    </w:p>
+    <w:p>
+      <w:pPr>
+        <w:pStyle w:val="PargrafodaLista"/>
+        <w:numPr>
+          <w:ilvl w:val="0"/>
+          <w:numId w:val="3"/>
+        </w:numPr>
+        <w:spacing w:after="80" w:line="290" w:lineRule="auto"/>
+      </w:pPr>
+      <w:r>
+        <w:rPr>
+          <w:b/>
+        </w:rPr>
+        <w:t>IA dos aliados (§5 e §11):</w:t>
+      </w:r>
+      <w:r>
+        <w:t xml:space="preserve"> a IA de cada aliado melhora com o nível do personagem. Do nível 1 ao 29 é básica (erra mais e todo mundo vai para o meio da luta), do 30 ao 69 é média (Arqueiro e Mago mantêm a distância e procuram linha de tiro) e do 70 ao 100 é avançada (formação de combate com o Tanque na frente, momentos de foco em que quase não erra). Nenhum nível é perfeito, o jogador não escolhe o nível e os aliados não esquivam: a esquiva é só do Líder. Parados, os aliados param em qualquer ponto perto do Líder, sem ficar se ajustando. Os números são provisórios e ficam no Balanceamento.md.</w:t>
       </w:r>
     </w:p>
     <w:sectPr>

</xml_diff>

<commit_message>
Fase 1, parte 5d: Sacerdote sempre curando e um nível da IA não atrapalha o outro
- Sacerdote cura sempre que alguém do grupo (ele também) não está com a vida cheia, em combate ou fora:
  caídos primeiro, depois o mais ferido, em empate o Líder; o nível muda só a posição e a escolha do alvo
  (quemCurar e posicaoParaCurar em regras/iaDosAliados.js)
- Média e avançada desviam de quem está parado no caminho (pontoDeDesvio em regras/movimento.js);
  o Guerreiro avançado não espera um Tanque que errou
- Roteiro do navegador: cura em até 3 s nos 3 níveis, desvio sem encostar, Guerreiro sem esperar (215)
- Modo contínuo no CLAUDE.md e "Onde parei" no PLANO.md
- Documentação: RF42, UC31, HU31, Conceito 21.5, Balanceamento (sem o limite de 70%) e testes/

Co-Authored-By: Claude Opus 5.5 <noreply@anthropic.com>
</commit_message>
<xml_diff>
--- a/documentacao/ideias/01_Conceito_do_Jogo.docx
+++ b/documentacao/ideias/01_Conceito_do_Jogo.docx
@@ -914,7 +914,6 @@
           <w:b/>
           <w:bCs/>
         </w:rPr>
-        <w:lastRenderedPageBreak/>
         <w:t>Reino:</w:t>
       </w:r>
       <w:r>
@@ -1255,7 +1254,6 @@
         <w:pStyle w:val="Ttulo1"/>
       </w:pPr>
       <w:r>
-        <w:lastRenderedPageBreak/>
         <w:t>5. Personagens e classes</w:t>
       </w:r>
     </w:p>
@@ -2658,7 +2656,6 @@
           <w:b/>
           <w:bCs/>
         </w:rPr>
-        <w:lastRenderedPageBreak/>
         <w:t>Mana:</w:t>
       </w:r>
       <w:r>
@@ -3007,7 +3004,6 @@
         <w:spacing w:after="120" w:line="300" w:lineRule="auto"/>
       </w:pPr>
       <w:r>
-        <w:lastRenderedPageBreak/>
         <w:t xml:space="preserve">O cadastro </w:t>
       </w:r>
       <w:r>
@@ -3631,7 +3627,6 @@
         <w:spacing w:after="80" w:line="290" w:lineRule="auto"/>
       </w:pPr>
       <w:r>
-        <w:lastRenderedPageBreak/>
         <w:t>O banco só recebe dados nesses momentos, nunca a cada ação, para não ficar pesado.</w:t>
       </w:r>
     </w:p>
@@ -3973,7 +3968,6 @@
         <w:spacing w:after="80" w:line="290" w:lineRule="auto"/>
       </w:pPr>
       <w:r>
-        <w:lastRenderedPageBreak/>
         <w:t xml:space="preserve">O progresso só conta </w:t>
       </w:r>
       <w:r>
@@ -4834,7 +4828,6 @@
                 <w:sz w:val="20"/>
                 <w:szCs w:val="20"/>
               </w:rPr>
-              <w:lastRenderedPageBreak/>
               <w:t>Tecla</w:t>
             </w:r>
           </w:p>
@@ -5731,7 +5724,6 @@
         <w:spacing w:after="80" w:line="290" w:lineRule="auto"/>
       </w:pPr>
       <w:r>
-        <w:lastRenderedPageBreak/>
         <w:t xml:space="preserve">Item que não cabe </w:t>
       </w:r>
       <w:r>
@@ -6138,7 +6130,6 @@
                 <w:sz w:val="20"/>
                 <w:szCs w:val="20"/>
               </w:rPr>
-              <w:lastRenderedPageBreak/>
               <w:t>Resultado</w:t>
             </w:r>
           </w:p>
@@ -11378,6 +11369,44 @@
       </w:r>
       <w:r>
         <w:t xml:space="preserve"> a chance de crítico é de 5% mais 0,5% por ponto de Agilidade, e o golpe crítico causa 1,5 vez o dano. Os números são provisórios e ficam no Balanceamento.md.</w:t>
+      </w:r>
+    </w:p>
+    <w:p>
+      <w:pPr>
+        <w:pStyle w:val="PargrafodaLista"/>
+        <w:numPr>
+          <w:ilvl w:val="0"/>
+          <w:numId w:val="3"/>
+        </w:numPr>
+        <w:spacing w:after="80" w:line="290" w:lineRule="auto"/>
+      </w:pPr>
+      <w:r>
+        <w:rPr>
+          <w:b/>
+        </w:rPr>
+        <w:t>Sacerdote sempre curando (§5 e §11):</w:t>
+      </w:r>
+      <w:r>
+        <w:t xml:space="preserve"> o Sacerdote cura sempre que alguém do grupo, ele mesmo também, não está com a vida cheia, em combate ou fora dele. Primeiro levanta os caídos, depois cura o mais ferido e, em empate, o Líder. O nível da IA muda só a posição dele (a avançada cura de trás do ferido, longe do monstro) e a escolha do alvo (a básica às vezes escolhe pior), nunca o fato de curar.</w:t>
+      </w:r>
+    </w:p>
+    <w:p>
+      <w:pPr>
+        <w:pStyle w:val="PargrafodaLista"/>
+        <w:numPr>
+          <w:ilvl w:val="0"/>
+          <w:numId w:val="3"/>
+        </w:numPr>
+        <w:spacing w:after="80" w:line="290" w:lineRule="auto"/>
+      </w:pPr>
+      <w:r>
+        <w:rPr>
+          <w:b/>
+        </w:rPr>
+        <w:t>Um nível da IA não atrapalha o outro (§11):</w:t>
+      </w:r>
+      <w:r>
+        <w:t xml:space="preserve"> cada aliado decide pelo próprio nível. A média e a avançada desviam de quem está parado no caminho (a avançada de longe, a média quando quase encosta), e o Guerreiro avançado não espera um Tanque que errou: vai proteger o Líder.</w:t>
       </w:r>
     </w:p>
     <w:sectPr>

</xml_diff>

<commit_message>
Fase 1, parte 5e: DOC-003, ataques de clique, esquiva e cores na documentação
- RF36, UC32, HU32 e Conceito 21.5: o ataque de clique de cada classe, a esquiva sem dano durante o avanço e as cores
- Pendente com o grupo: ataques definitivos, aura do Sacerdote (ataque ou habilidade) e cor do Guerreiro

Co-Authored-By: Claude Opus 5.5 <noreply@anthropic.com>
</commit_message>
<xml_diff>
--- a/documentacao/ideias/01_Conceito_do_Jogo.docx
+++ b/documentacao/ideias/01_Conceito_do_Jogo.docx
@@ -11407,6 +11407,25 @@
       </w:r>
       <w:r>
         <w:t xml:space="preserve"> cada aliado decide pelo próprio nível. A média e a avançada desviam de quem está parado no caminho (a avançada de longe, a média quando quase encosta), e o Guerreiro avançado não espera um Tanque que errou: vai proteger o Líder.</w:t>
+      </w:r>
+    </w:p>
+    <w:p>
+      <w:pPr>
+        <w:pStyle w:val="PargrafodaLista"/>
+        <w:numPr>
+          <w:ilvl w:val="0"/>
+          <w:numId w:val="3"/>
+        </w:numPr>
+        <w:spacing w:after="80" w:line="290" w:lineRule="auto"/>
+      </w:pPr>
+      <w:r>
+        <w:rPr>
+          <w:b/>
+        </w:rPr>
+        <w:t>Ataques de clique, esquiva e cores (§5 e §11.3):</w:t>
+      </w:r>
+      <w:r>
+        <w:t xml:space="preserve"> o clique faz o ataque básico da classe do Líder, sem mana e com recarga curta: Guerreiro, golpe de espada em arco curto; Arqueiro, flecha rápida e de longo alcance; Mago, bola mágica lenta que explode em área; Tanque, escudo que bloqueia o que vem da frente e empurra no clique; Sacerdote, aura que cura quem estiver dentro dela por alguns segundos. A esquiva (Espaço, só do Líder) é um avanço curto, sem mana e com recarga, e não deixa levar dano durante o avanço. Na partida, cada classe tem uma cor (Guerreiro azul, Mago roxo, Tanque laranja, Sacerdote amarelo, Arqueiro ciano), e os inimigos são vermelhos. Ainda falta o grupo confirmar se esses ataques são os definitivos, se a aura do Sacerdote é ataque básico ou habilidade e a cor do Guerreiro (o protótipo 06 usa vermelho).</w:t>
       </w:r>
     </w:p>
     <w:sectPr>

</xml_diff>

<commit_message>
Documentação dos ajustes da versão final e correções dos roteiros
- requisitos (RF13, RF18, RF20, RF35, RF36, RF40, RF41, RF53, RF54, RNF03, RNF09), casos de uso, histórias e
  'Alterações do projeto'; Conceito com a seção 21.6; Guia de Interface (partida, tela cheia, carregamento,
  descartar); Balanceamento com o arco, o corpo menor e as rodadas por dia; CLAUDE.md e PLANO.md (proposta do escudo)
- testes/Roteiros.md: VF-09 a VF-20
- motor do jogo que não chegou: 'Tentar de novo' recarrega a página (o navegador guarda a falha do download)
- roteiros: esperas do HUD em vez de pausas fixas; mobs medidos pelo corpo que colide; 'E: pegar' no lugar novo

Co-Authored-By: Claude Opus 5.5 <noreply@anthropic.com>
</commit_message>
<xml_diff>
--- a/documentacao/ideias/01_Conceito_do_Jogo.docx
+++ b/documentacao/ideias/01_Conceito_do_Jogo.docx
@@ -11426,6 +11426,204 @@
       </w:r>
       <w:r>
         <w:t xml:space="preserve"> o clique faz o ataque básico da classe do Líder, sem mana e com recarga curta: Guerreiro, golpe de espada em arco curto; Arqueiro, flecha rápida e de longo alcance; Mago, bola mágica lenta que explode em área; Tanque, escudo que bloqueia o que vem da frente e empurra no clique; Sacerdote, aura que cura quem estiver dentro dela por alguns segundos. A esquiva (Espaço, só do Líder) é um avanço curto, sem mana e com recarga, e não deixa levar dano durante o avanço. Na partida, cada classe tem uma cor (Guerreiro azul, Mago roxo, Tanque laranja, Sacerdote amarelo, Arqueiro ciano), e os inimigos são vermelhos. Ainda falta o grupo confirmar se esses ataques são os definitivos, se a aura do Sacerdote é ataque básico ou habilidade e a cor do Guerreiro (o protótipo 06 usa vermelho).</w:t>
+      </w:r>
+    </w:p>
+    <w:p>
+      <w:pPr>
+        <w:pStyle w:val="Ttulo2"/>
+      </w:pPr>
+      <w:r>
+        <w:t>21.6 Ajustes da versão final (14/10/2026)</w:t>
+      </w:r>
+    </w:p>
+    <w:p>
+      <w:pPr>
+        <w:pStyle w:val="PargrafodaLista"/>
+        <w:numPr>
+          <w:ilvl w:val="0"/>
+          <w:numId w:val="3"/>
+        </w:numPr>
+        <w:spacing w:after="80" w:line="290" w:lineRule="auto"/>
+      </w:pPr>
+      <w:r>
+        <w:rPr>
+          <w:b/>
+        </w:rPr>
+        <w:t>Telas mais intuitivas (§3 e §15):</w:t>
+      </w:r>
+      <w:r>
+        <w:t xml:space="preserve"> no alto de cada tela, uma trilha mostra onde o jogador está ("Reino › Forja › Equipar"). Fora da partida, o Esc faz o mesmo que o botão Voltar. Na primeira visita a cada tela, uma dica curta diz para que ela serve; o "?" reabre a dica. Toda ação importante confirma o que aconteceu ("Você comprou 1 Poção de vida · −25 de ouro"), e o Como jogar mostra os controles e as regras atuais.</w:t>
+      </w:r>
+    </w:p>
+    <w:p>
+      <w:pPr>
+        <w:pStyle w:val="PargrafodaLista"/>
+        <w:numPr>
+          <w:ilvl w:val="0"/>
+          <w:numId w:val="3"/>
+        </w:numPr>
+        <w:spacing w:after="80" w:line="290" w:lineRule="auto"/>
+      </w:pPr>
+      <w:r>
+        <w:rPr>
+          <w:b/>
+        </w:rPr>
+        <w:t>Descartar (§10):</w:t>
+      </w:r>
+      <w:r>
+        <w:t xml:space="preserve"> em todas as mochilas, escolhendo 1, várias ou todas, com confirmação. Na Mochila do Reino o item some; na mochila da partida, ele cai no chão perto do Líder.</w:t>
+      </w:r>
+    </w:p>
+    <w:p>
+      <w:pPr>
+        <w:pStyle w:val="PargrafodaLista"/>
+        <w:numPr>
+          <w:ilvl w:val="0"/>
+          <w:numId w:val="3"/>
+        </w:numPr>
+        <w:spacing w:after="80" w:line="290" w:lineRule="auto"/>
+      </w:pPr>
+      <w:r>
+        <w:rPr>
+          <w:b/>
+        </w:rPr>
+        <w:t>Itens no chão (§11):</w:t>
+      </w:r>
+      <w:r>
+        <w:t xml:space="preserve"> o item natural (os recursos do mapa) fica até alguém pegar e nunca some sozinho. O item dropado (o que um monstro deixa cair e o que o jogador descarta) some 30 segundos depois de cair, com um anel que mostra o tempo, e pisca nos últimos 5 segundos; descartado de novo, cai com o tempo novo.</w:t>
+      </w:r>
+    </w:p>
+    <w:p>
+      <w:pPr>
+        <w:pStyle w:val="PargrafodaLista"/>
+        <w:numPr>
+          <w:ilvl w:val="0"/>
+          <w:numId w:val="3"/>
+        </w:numPr>
+        <w:spacing w:after="80" w:line="290" w:lineRule="auto"/>
+      </w:pPr>
+      <w:r>
+        <w:rPr>
+          <w:b/>
+        </w:rPr>
+        <w:t>Tela cheia (§15):</w:t>
+      </w:r>
+      <w:r>
+        <w:t xml:space="preserve"> o jogo entra em tela cheia no mesmo clique de Iniciar jogo, Jogar e Começar partida, a menos que o jogador desligue nas Configurações. Um X discreto no canto sai dela. No Chrome e no Edge, o Esc continua pausando o jogo; nos outros navegadores, sair da tela cheia no meio da partida vale como Esc, e aparece um botão para voltar a ela. O jogo vai de 1366×768 a 1920×1080.</w:t>
+      </w:r>
+    </w:p>
+    <w:p>
+      <w:pPr>
+        <w:pStyle w:val="PargrafodaLista"/>
+        <w:numPr>
+          <w:ilvl w:val="0"/>
+          <w:numId w:val="3"/>
+        </w:numPr>
+        <w:spacing w:after="80" w:line="290" w:lineRule="auto"/>
+      </w:pPr>
+      <w:r>
+        <w:rPr>
+          <w:b/>
+        </w:rPr>
+        <w:t>HUD da partida (§11):</w:t>
+      </w:r>
+      <w:r>
+        <w:t xml:space="preserve"> em vez de uma faixa escura no topo, grupos translúcidos sobre o mapa: em cima à esquerda o Líder e o grupo; em cima no meio o tempo, os pontos, o ouro e o custo da fuga; em cima à direita o minimapa, a região e a mochila; embaixo no meio a barra de ações, com a recarga em volta de cada ícone. Os avisos aparecem num lugar fixo, no máximo três de cada vez.</w:t>
+      </w:r>
+    </w:p>
+    <w:p>
+      <w:pPr>
+        <w:pStyle w:val="PargrafodaLista"/>
+        <w:numPr>
+          <w:ilvl w:val="0"/>
+          <w:numId w:val="3"/>
+        </w:numPr>
+        <w:spacing w:after="80" w:line="290" w:lineRule="auto"/>
+      </w:pPr>
+      <w:r>
+        <w:rPr>
+          <w:b/>
+        </w:rPr>
+        <w:t>Minijogos (§14):</w:t>
+      </w:r>
+      <w:r>
+        <w:t xml:space="preserve"> cada minijogo (Fazenda, Mina e Lago) tem um número de rodadas por dia (provisório: 3), que renova à meia-noite de Brasília. Para quem tem conta, vale a hora do servidor, para não dar para ganhar rodadas mudando o relógio do computador; para o convidado, a do navegador. A tela mostra "Rodadas hoje: 2 de 3 · renova em 05:12".</w:t>
+      </w:r>
+    </w:p>
+    <w:p>
+      <w:pPr>
+        <w:pStyle w:val="PargrafodaLista"/>
+        <w:numPr>
+          <w:ilvl w:val="0"/>
+          <w:numId w:val="3"/>
+        </w:numPr>
+        <w:spacing w:after="80" w:line="290" w:lineRule="auto"/>
+      </w:pPr>
+      <w:r>
+        <w:rPr>
+          <w:b/>
+        </w:rPr>
+        <w:t>Esbarrões (§11):</w:t>
+      </w:r>
+      <w:r>
+        <w:t xml:space="preserve"> o corpo que colide de cada personagem e monstro ficou bem menor que o desenho, para o grupo deslizar um no outro e nas pedras. A área que recebe golpes continua do tamanho do desenho, para o combate não ficar injusto.</w:t>
+      </w:r>
+    </w:p>
+    <w:p>
+      <w:pPr>
+        <w:pStyle w:val="PargrafodaLista"/>
+        <w:numPr>
+          <w:ilvl w:val="0"/>
+          <w:numId w:val="3"/>
+        </w:numPr>
+        <w:spacing w:after="80" w:line="290" w:lineRule="auto"/>
+      </w:pPr>
+      <w:r>
+        <w:rPr>
+          <w:b/>
+        </w:rPr>
+        <w:t>Carregamento (§3):</w:t>
+      </w:r>
+      <w:r>
+        <w:t xml:space="preserve"> ao abrir o site, uma tela de carregamento aparece na hora; ao entrar na partida, ela mostra o progresso de verdade e uma dica do jogo. Se algo demorar demais ou falhar, aparece uma mensagem clara com "Tentar de novo". Entre o Reino, o Mapa e a partida, a troca de tela é suave.</w:t>
+      </w:r>
+    </w:p>
+    <w:p>
+      <w:pPr>
+        <w:pStyle w:val="PargrafodaLista"/>
+        <w:numPr>
+          <w:ilvl w:val="0"/>
+          <w:numId w:val="3"/>
+        </w:numPr>
+        <w:spacing w:after="80" w:line="290" w:lineRule="auto"/>
+      </w:pPr>
+      <w:r>
+        <w:rPr>
+          <w:b/>
+        </w:rPr>
+        <w:t>Arco que carrega (§5 e §11.3):</w:t>
+      </w:r>
+      <w:r>
+        <w:t xml:space="preserve"> o Arqueiro segura o clique para puxar o arco e solta para atirar. Quanto mais carregado, até a carga cheia, mais longe a flecha vai, mais rápida voa e mais dano dá; cliques rápidos soltam flechas curtas, lentas e fracas. A Força dá o dano da flecha; a Agilidade encurta o tempo de carregar, sem passar de um mínimo, e continua dando o crítico. Carregar cheio sempre rende mais dano por segundo que clicar rápido. Puxando o arco, o Arqueiro anda mais devagar. O Arqueiro aliado também carrega, conforme o nível da IA. Os números são provisórios e ficam no Balanceamento.md.</w:t>
+      </w:r>
+    </w:p>
+    <w:p>
+      <w:pPr>
+        <w:pStyle w:val="PargrafodaLista"/>
+        <w:numPr>
+          <w:ilvl w:val="0"/>
+          <w:numId w:val="3"/>
+        </w:numPr>
+        <w:spacing w:after="80" w:line="290" w:lineRule="auto"/>
+      </w:pPr>
+      <w:r>
+        <w:rPr>
+          <w:b/>
+        </w:rPr>
+        <w:t>Tanque (§5):</w:t>
+      </w:r>
+      <w:r>
+        <w:t xml:space="preserve"> o escudo segura só golpes e projéteis que vêm pela frente; ataques em área, como o pisão do Boss, atingem o Tanque normalmente (antes, com o escudo de frente, ele não levava o pisão). Previsto para depois do balanceamento: o escudo não segura golpes fortes demais quando o Tanque não tem Força suficiente.</w:t>
       </w:r>
     </w:p>
     <w:sectPr>

</xml_diff>

<commit_message>
Parte 4: escudo do Tanque contra golpe forte
- regras/combate.js: limiteDoEscudo (10 + 1,5 × Força, provisório) e
  golpeNoEscudo ('bloqueado', 'rompido' ou 'passa'), com testes abaixo, no
  limite e acima, com Força baixa e alta, projétil e área
- CenaArena: golpe e projétil acima do limite rompem o escudo: o Tanque leva o
  dano inteiro, "Escudo rompido!", o escudo treme e fica avermelhado
- investida do Boss 22 → 40 (provisório): o golpe mais forte da Floresta,
  rompe o escudo do Tanque do começo e é segurada a partir da Força 20
- limites novos no balanceamento.test.js; Balanceamento.md com o escudo, o
  movimento e a passagem pelos aliados; arena seção 37 e Floresta (investida)
- RF36, UC32, HU32, Alterações do projeto e Conceito 21.7 (as quatro partes)

Co-Authored-By: Claude Opus 5.5 <noreply@anthropic.com>
</commit_message>
<xml_diff>
--- a/documentacao/ideias/01_Conceito_do_Jogo.docx
+++ b/documentacao/ideias/01_Conceito_do_Jogo.docx
@@ -11624,6 +11624,90 @@
       </w:r>
       <w:r>
         <w:t xml:space="preserve"> o escudo segura só golpes e projéteis que vêm pela frente; ataques em área, como o pisão do Boss, atingem o Tanque normalmente (antes, com o escudo de frente, ele não levava o pisão). Previsto para depois do balanceamento: o escudo não segura golpes fortes demais quando o Tanque não tem Força suficiente.</w:t>
+      </w:r>
+    </w:p>
+    <w:p>
+      <w:pPr>
+        <w:pStyle w:val="Ttulo2"/>
+      </w:pPr>
+      <w:r>
+        <w:t>21.7 Ajustes na partida (14/10/2026)</w:t>
+      </w:r>
+    </w:p>
+    <w:p>
+      <w:pPr>
+        <w:pStyle w:val="PargrafodaLista"/>
+        <w:numPr>
+          <w:ilvl w:val="0"/>
+          <w:numId w:val="3"/>
+        </w:numPr>
+        <w:spacing w:after="80" w:line="290" w:lineRule="auto"/>
+      </w:pPr>
+      <w:r>
+        <w:rPr>
+          <w:b/>
+        </w:rPr>
+        <w:t>O Líder nunca é teletransportado (§11):</w:t>
+      </w:r>
+      <w:r>
+        <w:t xml:space="preserve"> encostado numa pedra, na mata fechada ou na borda do mapa, o Líder para ou segue a parede devagar (empurrando de frente, ele não escorrega de lado; na quina, para) e nunca pula de lugar. O mesmo vale para os aliados e os monstros que estão na tela; só um aliado preso fora da tela pode reaparecer perto do grupo, entrando andando. Antes, quem entrava num bloco grande de mata podia ser tirado do outro lado dele (saltos de até 1.735 px).</w:t>
+      </w:r>
+    </w:p>
+    <w:p>
+      <w:pPr>
+        <w:pStyle w:val="PargrafodaLista"/>
+        <w:numPr>
+          <w:ilvl w:val="0"/>
+          <w:numId w:val="3"/>
+        </w:numPr>
+        <w:spacing w:after="80" w:line="290" w:lineRule="auto"/>
+      </w:pPr>
+      <w:r>
+        <w:rPr>
+          <w:b/>
+        </w:rPr>
+        <w:t>Passar pelos aliados (§5 e §11):</w:t>
+      </w:r>
+      <w:r>
+        <w:t xml:space="preserve"> quando o Líder anda contra o grupo, o aliado no caminho sai para o lado antes do encontro e o grupo se fecha depois, como água (a IA avançada abre mais cedo e mais limpo). Se o aliado não tem para onde sair (pedra, mata, borda ou outros aliados), o Líder passa por dentro dele, sem empurrar ninguém para dentro de nada, e a colisão volta logo depois. Na fuga (F) e no retorno (Q), o Líder passa por todos. Os aliados nunca ficam um em cima do outro, e os monstros continuam colidindo.</w:t>
+      </w:r>
+    </w:p>
+    <w:p>
+      <w:pPr>
+        <w:pStyle w:val="PargrafodaLista"/>
+        <w:numPr>
+          <w:ilvl w:val="0"/>
+          <w:numId w:val="3"/>
+        </w:numPr>
+        <w:spacing w:after="80" w:line="290" w:lineRule="auto"/>
+      </w:pPr>
+      <w:r>
+        <w:rPr>
+          <w:b/>
+        </w:rPr>
+        <w:t>Mochila estilo inventário (§10 e §11):</w:t>
+      </w:r>
+      <w:r>
+        <w:t xml:space="preserve"> na partida, Tab abre a janela MOCHILA no meio da tela, com o peso usado e a capacidade e o mapa um pouco escuro atrás. O jogo não pausa, mas o Líder fica parado (não anda, não ataca, não coleta). Os itens se mexem com o mouse, como no Minecraft: o clique pega a pilha inteira (o item vai na mão, seguindo o mouse), o botão direito pega a metade, e clicar noutro quadradinho põe ou troca de lugar. Clicar fora da janela com um item na mão joga o item no chão perto do Líder, como item dropado (some em 30 segundos); fechar a janela com item na mão devolve o item. Passar o mouse mostra o nome e o efeito. Com o mouse num consumível, E usa no Líder e R no aliado que mais precisa dele (poção de vida: o mais ferido; de mana: o com menos mana; acelerador: o mais perto do Líder). A Mochila do Reino usa a mesma grade, e lá o descarte vai para uma lixeira, com confirmação.</w:t>
+      </w:r>
+    </w:p>
+    <w:p>
+      <w:pPr>
+        <w:pStyle w:val="PargrafodaLista"/>
+        <w:numPr>
+          <w:ilvl w:val="0"/>
+          <w:numId w:val="3"/>
+        </w:numPr>
+        <w:spacing w:after="80" w:line="290" w:lineRule="auto"/>
+      </w:pPr>
+      <w:r>
+        <w:rPr>
+          <w:b/>
+        </w:rPr>
+        <w:t>Escudo contra golpe forte (§5):</w:t>
+      </w:r>
+      <w:r>
+        <w:t xml:space="preserve"> o escudo do Tanque segura golpes e projéteis que vêm pela frente só até um limite que cresce com a Força dele: 10 + 1,5 × Força (com a Força 15 do começo, 32,5 de dano; com Força 100, 160). Um golpe mais forte rompe o escudo: aparece "Escudo rompido!", o escudo treme e o Tanque leva o dano inteiro. Ataques em área continuam atingindo o Tanque. A investida do Guardião da Floresta passou a 40 de dano, o golpe mais forte da Floresta: rompe o escudo do Tanque do começo e é segurada a partir da Força 20. Os números são provisórios e ficam no Balanceamento.md.</w:t>
       </w:r>
     </w:p>
     <w:sectPr>

</xml_diff>

<commit_message>
Visual novo, parte F: roteiro do Reino e do Mapa ilustrados, documentação e testes
- testar:reino seção 1b (16 conferências): cada placa e desenho do Reino leva
  ao lugar certo com clique de verdade, brilho, legenda e cursor ao passar o
  mouse, a área no mesmo lugar da imagem; no Mapa, cadeados, o contorno que
  acende, a Tundra bloqueada, o castelo, a Fazenda e a Floresta; tudo em
  1366×768 e 1920×1080 (prints do Reino em JPG)
- UC27, HU27, Conceito 21.8; Registro (linha e 2l) e roteiros VN-01 a VN-07

Co-Authored-By: Claude Opus 5.5 <noreply@anthropic.com>
</commit_message>
<xml_diff>
--- a/documentacao/ideias/01_Conceito_do_Jogo.docx
+++ b/documentacao/ideias/01_Conceito_do_Jogo.docx
@@ -11708,6 +11708,71 @@
       </w:r>
       <w:r>
         <w:t xml:space="preserve"> o escudo do Tanque segura golpes e projéteis que vêm pela frente só até um limite que cresce com a Força dele: 10 + 1,5 × Força (com a Força 15 do começo, 32,5 de dano; com Força 100, 160). Um golpe mais forte rompe o escudo: aparece "Escudo rompido!", o escudo treme e o Tanque leva o dano inteiro. Ataques em área continuam atingindo o Tanque. A investida do Guardião da Floresta passou a 40 de dano, o golpe mais forte da Floresta: rompe o escudo do Tanque do começo e é segurada a partir da Força 20. Os números são provisórios e ficam no Balanceamento.md.</w:t>
+      </w:r>
+    </w:p>
+    <w:p>
+      <w:pPr>
+        <w:pStyle w:val="Ttulo2"/>
+      </w:pPr>
+      <w:r>
+        <w:t>21.8 Visual novo (20/10/2026)</w:t>
+      </w:r>
+    </w:p>
+    <w:p>
+      <w:pPr>
+        <w:pStyle w:val="PargrafodaLista"/>
+        <w:numPr>
+          <w:ilvl w:val="0"/>
+          <w:numId w:val="3"/>
+        </w:numPr>
+        <w:spacing w:after="80" w:line="290" w:lineRule="auto"/>
+      </w:pPr>
+      <w:r>
+        <w:rPr>
+          <w:b/>
+        </w:rPr>
+        <w:t>Reino e Mapa ilustrados (§3 e §15):</w:t>
+      </w:r>
+      <w:r>
+        <w:t xml:space="preserve"> as telas do Reino e do Mapa passam a ser duas imagens trazidas pelo Pablo, em pixel art viva. No Reino, os botões (Salão da Glória, Configurações, Guilda, Mercado, Forja, Mochila, JOGAR e Árvores de Habilidades) vêm desenhados na imagem, como placas escuras com borda dourada; em cima de cada um fica uma área clicável invisível, que acende ao passar o mouse. Só o que muda (apelido, Líder, ouro e missão) é texto do jogo, numa faixa discreta. No Mapa, cada região clica no formato dela: a Floresta abre a partida; a Tundra, o Vulcânico e o Deserto aparecem com cadeado e "Em breve"; no Planalto, o castelo volta ao Reino e a fazenda, a mina e o lago abrem os minijogos. Esta é uma exceção à regra de nunca ter texto desenhado dentro da imagem (RNF04).</w:t>
+      </w:r>
+    </w:p>
+    <w:p>
+      <w:pPr>
+        <w:pStyle w:val="PargrafodaLista"/>
+        <w:numPr>
+          <w:ilvl w:val="0"/>
+          <w:numId w:val="3"/>
+        </w:numPr>
+        <w:spacing w:after="80" w:line="290" w:lineRule="auto"/>
+      </w:pPr>
+      <w:r>
+        <w:rPr>
+          <w:b/>
+        </w:rPr>
+        <w:t>Identidade visual (§15):</w:t>
+      </w:r>
+      <w:r>
+        <w:t xml:space="preserve"> todas as telas seguem as duas imagens: placas escuras com borda dourada e texto claro nos botões, o botão principal vermelho e dourado (como o JOGAR), os títulos numa faixa vermelha, painéis de pergaminho no tema claro e de madeira escura no tema escuro, janelas com moldura dourada e uma fonte em pixel de licença livre (Pixelify Sans). Tudo feito em código, trocável pela arte quando ela chegar.</w:t>
+      </w:r>
+    </w:p>
+    <w:p>
+      <w:pPr>
+        <w:pStyle w:val="PargrafodaLista"/>
+        <w:numPr>
+          <w:ilvl w:val="0"/>
+          <w:numId w:val="3"/>
+        </w:numPr>
+        <w:spacing w:after="80" w:line="290" w:lineRule="auto"/>
+      </w:pPr>
+      <w:r>
+        <w:rPr>
+          <w:b/>
+        </w:rPr>
+        <w:t>Personagens (§5):</w:t>
+      </w:r>
+      <w:r>
+        <w:t xml:space="preserve"> o estilo dos personagens passa a ser o do jogo Taskbar Hero, usado só como referência: chibi pequeno, de cabeça grande (perto de metade da altura) e olhos grandes, contorno escuro fino em marrom, sombreamento suave de 2 a 3 tons e cores um pouco dessaturadas com detalhes vivos, com 48 px de altura e vistos de cima em 3/4. Um primeiro Mago, feito num estilo escolhido sem consultar o Pablo, foi descartado; antes de cada personagem, um teste de estilo passa pela aprovação dele.</w:t>
       </w:r>
     </w:p>
     <w:sectPr>

</xml_diff>